<commit_message>
Changed the primary file
</commit_message>
<xml_diff>
--- a/CIET-Concept-Note-Template.docx
+++ b/CIET-Concept-Note-Template.docx
@@ -24,12 +24,6 @@
         <w:gridCol w:w="7426"/>
       </w:tblGrid>
       <w:tr>
-        <w:tblPrEx>
-          <w:tblCellMar>
-            <w:top w:w="0" w:type="dxa"/>
-            <w:bottom w:w="0" w:type="dxa"/>
-          </w:tblCellMar>
-        </w:tblPrEx>
         <w:trPr>
           <w:cantSplit/>
         </w:trPr>
@@ -134,7 +128,7 @@
                 <w:sz w:val="16"/>
                 <w:szCs w:val="16"/>
               </w:rPr>
-              <w:t xml:space="preserve">[Programme Series]</w:t>
+              <w:t>[Programme Series]</w:t>
             </w:r>
           </w:p>
           <w:p>
@@ -150,7 +144,7 @@
                 <w:sz w:val="29"/>
                 <w:szCs w:val="29"/>
               </w:rPr>
-              <w:t xml:space="preserve">[Programme Title]</w:t>
+              <w:t>[Programme Title]</w:t>
             </w:r>
           </w:p>
           <w:p>
@@ -163,7 +157,7 @@
                 <w:sz w:val="21"/>
                 <w:szCs w:val="21"/>
               </w:rPr>
-              <w:t xml:space="preserve">[Subtitle — one line naming the arc of the programme]</w:t>
+              <w:t>[Subtitle — one line naming the arc of the programme]</w:t>
             </w:r>
           </w:p>
         </w:tc>
@@ -206,12 +200,6 @@
         <w:gridCol w:w="2438"/>
       </w:tblGrid>
       <w:tr>
-        <w:tblPrEx>
-          <w:tblCellMar>
-            <w:top w:w="0" w:type="dxa"/>
-            <w:bottom w:w="0" w:type="dxa"/>
-          </w:tblCellMar>
-        </w:tblPrEx>
         <w:trPr>
           <w:cantSplit/>
         </w:trPr>
@@ -263,7 +251,7 @@
                 <w:sz w:val="18"/>
                 <w:szCs w:val="18"/>
               </w:rPr>
-              <w:t xml:space="preserve">[0 Days]</w:t>
+              <w:t>[0 Days]</w:t>
             </w:r>
           </w:p>
         </w:tc>
@@ -315,7 +303,7 @@
                 <w:sz w:val="18"/>
                 <w:szCs w:val="18"/>
               </w:rPr>
-              <w:t xml:space="preserve">[Dates]</w:t>
+              <w:t>[Dates]</w:t>
             </w:r>
           </w:p>
         </w:tc>
@@ -367,7 +355,7 @@
                 <w:sz w:val="18"/>
                 <w:szCs w:val="18"/>
               </w:rPr>
-              <w:t xml:space="preserve">[Mode]</w:t>
+              <w:t>[Mode]</w:t>
             </w:r>
           </w:p>
         </w:tc>
@@ -419,7 +407,7 @@
                 <w:sz w:val="18"/>
                 <w:szCs w:val="18"/>
               </w:rPr>
-              <w:t xml:space="preserve">[Audience]</w:t>
+              <w:t>[Audience]</w:t>
             </w:r>
           </w:p>
         </w:tc>
@@ -453,12 +441,6 @@
         <w:gridCol w:w="3250"/>
       </w:tblGrid>
       <w:tr>
-        <w:tblPrEx>
-          <w:tblCellMar>
-            <w:top w:w="0" w:type="dxa"/>
-            <w:bottom w:w="0" w:type="dxa"/>
-          </w:tblCellMar>
-        </w:tblPrEx>
         <w:trPr>
           <w:cantSplit/>
         </w:trPr>
@@ -501,6 +483,7 @@
             <w:pPr>
               <w:spacing w:line="264" w:lineRule="auto"/>
             </w:pPr>
+            <w:proofErr w:type="spellStart"/>
             <w:r>
               <w:rPr>
                 <w:rFonts w:ascii="Calibri" w:eastAsia="Calibri" w:hAnsi="Calibri" w:cs="Calibri"/>
@@ -510,7 +493,19 @@
                 <w:sz w:val="18"/>
                 <w:szCs w:val="18"/>
               </w:rPr>
-              <w:t>Center for Innovation,</w:t>
+              <w:t>Center</w:t>
+            </w:r>
+            <w:proofErr w:type="spellEnd"/>
+            <w:r>
+              <w:rPr>
+                <w:rFonts w:ascii="Calibri" w:eastAsia="Calibri" w:hAnsi="Calibri" w:cs="Calibri"/>
+                <w:b/>
+                <w:bCs/>
+                <w:color w:val="1B3B66"/>
+                <w:sz w:val="18"/>
+                <w:szCs w:val="18"/>
+              </w:rPr>
+              <w:t xml:space="preserve"> for Innovation,</w:t>
             </w:r>
           </w:p>
           <w:p>
@@ -578,7 +573,7 @@
                 <w:sz w:val="18"/>
                 <w:szCs w:val="18"/>
               </w:rPr>
-              <w:t xml:space="preserve">[INR 0,000 / USD 00]</w:t>
+              <w:t>[INR 0,000 / USD 00]</w:t>
             </w:r>
           </w:p>
         </w:tc>
@@ -630,12 +625,45 @@
                 <w:sz w:val="18"/>
                 <w:szCs w:val="18"/>
               </w:rPr>
-              <w:t xml:space="preserve">[INR 0,000 / USD 00]</w:t>
+              <w:t>[INR 0,000 / USD 00]</w:t>
             </w:r>
           </w:p>
         </w:tc>
       </w:tr>
     </w:tbl>
+    <w:p>
+      <w:pPr>
+        <w:pBdr>
+          <w:bottom w:val="single" w:sz="10" w:space="6" w:color="B8892B"/>
+        </w:pBdr>
+        <w:spacing w:before="460" w:after="220" w:line="300" w:lineRule="auto"/>
+        <w:rPr>
+          <w:rFonts w:ascii="Georgia" w:eastAsia="Georgia" w:hAnsi="Georgia" w:cs="Georgia"/>
+          <w:b/>
+          <w:bCs/>
+          <w:caps/>
+          <w:color w:val="1B3B66"/>
+          <w:spacing w:val="30"/>
+          <w:sz w:val="25"/>
+          <w:szCs w:val="25"/>
+        </w:rPr>
+      </w:pPr>
+      <w:r>
+        <w:rPr>
+          <w:rFonts w:ascii="Georgia" w:eastAsia="Georgia" w:hAnsi="Georgia" w:cs="Georgia"/>
+          <w:b/>
+          <w:bCs/>
+          <w:caps/>
+          <w:color w:val="1B3B66"/>
+          <w:spacing w:val="30"/>
+          <w:sz w:val="25"/>
+          <w:szCs w:val="25"/>
+        </w:rPr>
+        <w:t>This is the change</w:t>
+      </w:r>
+      <w:bookmarkStart w:id="0" w:name="_GoBack"/>
+      <w:bookmarkEnd w:id="0"/>
+    </w:p>
     <w:p>
       <w:pPr>
         <w:pBdr>
@@ -667,23 +695,7 @@
           <w:rFonts w:ascii="Calibri" w:eastAsia="Calibri" w:hAnsi="Calibri" w:cs="Calibri"/>
           <w:color w:val="2E3742"/>
         </w:rPr>
-        <w:t xml:space="preserve">[Opening paragraph. Name the problem the programme addresses — what the audience currently cannot do, and the constraint that keeps it that way.]</w:t>
-      </w:r>
-      <w:bookmarkStart w:id="0" w:name="_GoBack"/>
-      <w:r>
-        <w:rPr>
-          <w:rFonts w:ascii="Calibri" w:eastAsia="Calibri" w:hAnsi="Calibri" w:cs="Calibri"/>
-          <w:color w:val="2E3742"/>
-        </w:rPr>
-        <w:t xml:space="preserve"/>
-      </w:r>
-      <w:bookmarkEnd w:id="0"/>
-      <w:r>
-        <w:rPr>
-          <w:rFonts w:ascii="Calibri" w:eastAsia="Calibri" w:hAnsi="Calibri" w:cs="Calibri"/>
-          <w:color w:val="2E3742"/>
-        </w:rPr>
-        <w:t xml:space="preserve"/>
+        <w:t>[Opening paragraph. Name the problem the programme addresses — what the audience currently cannot do, and the constraint that keeps it that way.]</w:t>
       </w:r>
     </w:p>
     <w:p>
@@ -696,7 +708,7 @@
           <w:rFonts w:ascii="Calibri" w:eastAsia="Calibri" w:hAnsi="Calibri" w:cs="Calibri"/>
           <w:color w:val="2E3742"/>
         </w:rPr>
-        <w:t xml:space="preserve">[Second paragraph. Sharpen the problem. What has this constraint quietly cost the field or the organisation?]</w:t>
+        <w:t>[Second paragraph. Sharpen the problem. What has this constraint quietly cost the field or the organisation?]</w:t>
       </w:r>
     </w:p>
     <w:p>
@@ -709,7 +721,7 @@
           <w:rFonts w:ascii="Calibri" w:eastAsia="Calibri" w:hAnsi="Calibri" w:cs="Calibri"/>
           <w:color w:val="2E3742"/>
         </w:rPr>
-        <w:t xml:space="preserve">[Third paragraph. Establish what has changed and why the programme is possible now. Cite sources where the claim needs support (Author, Year).]</w:t>
+        <w:t>[Third paragraph. Establish what has changed and why the programme is possible now. Cite sources where the claim needs support (Author, Year).]</w:t>
       </w:r>
     </w:p>
     <w:p>
@@ -722,7 +734,7 @@
           <w:rFonts w:ascii="Calibri" w:eastAsia="Calibri" w:hAnsi="Calibri" w:cs="Calibri"/>
           <w:color w:val="2E3742"/>
         </w:rPr>
-        <w:t xml:space="preserve">[Fourth paragraph. State plainly what the programme is, what it is not, and what participants walk out holding.]</w:t>
+        <w:t>[Fourth paragraph. State plainly what the programme is, what it is not, and what participants walk out holding.]</w:t>
       </w:r>
     </w:p>
     <w:tbl>
@@ -747,12 +759,6 @@
         <w:gridCol w:w="7846"/>
       </w:tblGrid>
       <w:tr>
-        <w:tblPrEx>
-          <w:tblCellMar>
-            <w:top w:w="0" w:type="dxa"/>
-            <w:bottom w:w="0" w:type="dxa"/>
-          </w:tblCellMar>
-        </w:tblPrEx>
         <w:trPr>
           <w:cantSplit/>
         </w:trPr>
@@ -820,7 +826,7 @@
                 <w:sz w:val="19"/>
                 <w:szCs w:val="19"/>
               </w:rPr>
-              <w:t xml:space="preserve">[One-line statement of what every participant must have in place before Day 1.]</w:t>
+              <w:t>[One-line statement of what every participant must have in place before Day 1.]</w:t>
             </w:r>
           </w:p>
         </w:tc>
@@ -844,7 +850,6 @@
           <w:sz w:val="25"/>
           <w:szCs w:val="25"/>
         </w:rPr>
-        <w:lastRenderedPageBreak/>
         <w:t>Programme Architecture</w:t>
       </w:r>
     </w:p>
@@ -858,7 +863,7 @@
           <w:rFonts w:ascii="Calibri" w:eastAsia="Calibri" w:hAnsi="Calibri" w:cs="Calibri"/>
           <w:color w:val="2E3742"/>
         </w:rPr>
-        <w:t xml:space="preserve">[Describe the organising spine of the programme — the single thread the sessions hang from, and what participants are expected to bring versus what is supplied.]</w:t>
+        <w:t>[Describe the organising spine of the programme — the single thread the sessions hang from, and what participants are expected to bring versus what is supplied.]</w:t>
       </w:r>
     </w:p>
     <w:tbl>
@@ -884,12 +889,6 @@
         <w:gridCol w:w="2900"/>
       </w:tblGrid>
       <w:tr>
-        <w:tblPrEx>
-          <w:tblCellMar>
-            <w:top w:w="0" w:type="dxa"/>
-            <w:bottom w:w="0" w:type="dxa"/>
-          </w:tblCellMar>
-        </w:tblPrEx>
         <w:trPr>
           <w:tblHeader/>
         </w:trPr>
@@ -1003,12 +1002,6 @@
         </w:tc>
       </w:tr>
       <w:tr>
-        <w:tblPrEx>
-          <w:tblCellMar>
-            <w:top w:w="0" w:type="dxa"/>
-            <w:bottom w:w="0" w:type="dxa"/>
-          </w:tblCellMar>
-        </w:tblPrEx>
         <w:trPr>
           <w:cantSplit/>
         </w:trPr>
@@ -1074,7 +1067,7 @@
                 <w:sz w:val="19"/>
                 <w:szCs w:val="19"/>
               </w:rPr>
-              <w:t xml:space="preserve">[Module 1 — what this environment or stage adds, and where it stops]</w:t>
+              <w:t>[Module 1 — what this environment or stage adds, and where it stops]</w:t>
             </w:r>
           </w:p>
         </w:tc>
@@ -1108,18 +1101,12 @@
                 <w:sz w:val="19"/>
                 <w:szCs w:val="19"/>
               </w:rPr>
-              <w:t xml:space="preserve">[Day 0, Session 0]</w:t>
+              <w:t>[Day 0, Session 0]</w:t>
             </w:r>
           </w:p>
         </w:tc>
       </w:tr>
       <w:tr>
-        <w:tblPrEx>
-          <w:tblCellMar>
-            <w:top w:w="0" w:type="dxa"/>
-            <w:bottom w:w="0" w:type="dxa"/>
-          </w:tblCellMar>
-        </w:tblPrEx>
         <w:trPr>
           <w:cantSplit/>
         </w:trPr>
@@ -1185,7 +1172,7 @@
                 <w:sz w:val="19"/>
                 <w:szCs w:val="19"/>
               </w:rPr>
-              <w:t xml:space="preserve">[Module 2 — what this environment or stage adds, and where it stops]</w:t>
+              <w:t>[Module 2 — what this environment or stage adds, and where it stops]</w:t>
             </w:r>
           </w:p>
         </w:tc>
@@ -1219,18 +1206,12 @@
                 <w:sz w:val="19"/>
                 <w:szCs w:val="19"/>
               </w:rPr>
-              <w:t xml:space="preserve">[Day 0, Session 0]</w:t>
+              <w:t>[Day 0, Session 0]</w:t>
             </w:r>
           </w:p>
         </w:tc>
       </w:tr>
       <w:tr>
-        <w:tblPrEx>
-          <w:tblCellMar>
-            <w:top w:w="0" w:type="dxa"/>
-            <w:bottom w:w="0" w:type="dxa"/>
-          </w:tblCellMar>
-        </w:tblPrEx>
         <w:trPr>
           <w:cantSplit/>
         </w:trPr>
@@ -1264,6 +1245,7 @@
                 <w:sz w:val="19"/>
                 <w:szCs w:val="19"/>
               </w:rPr>
+              <w:lastRenderedPageBreak/>
               <w:t>Build 3</w:t>
             </w:r>
           </w:p>
@@ -1296,7 +1278,7 @@
                 <w:sz w:val="19"/>
                 <w:szCs w:val="19"/>
               </w:rPr>
-              <w:t xml:space="preserve">[Module 3 — what this environment or stage adds, and where it stops]</w:t>
+              <w:t>[Module 3 — what this environment or stage adds, and where it stops]</w:t>
             </w:r>
           </w:p>
         </w:tc>
@@ -1330,7 +1312,7 @@
                 <w:sz w:val="19"/>
                 <w:szCs w:val="19"/>
               </w:rPr>
-              <w:t xml:space="preserve">[Day 0, Sessions 0-0]</w:t>
+              <w:t>[Day 0, Sessions 0-0]</w:t>
             </w:r>
           </w:p>
         </w:tc>
@@ -1351,7 +1333,7 @@
           <w:rFonts w:ascii="Calibri" w:eastAsia="Calibri" w:hAnsi="Calibri" w:cs="Calibri"/>
           <w:color w:val="2E3742"/>
         </w:rPr>
-        <w:t xml:space="preserve">[Paragraph on what sits alongside the main track — supporting sessions, and what they contribute that the build does not.]</w:t>
+        <w:t>[Paragraph on what sits alongside the main track — supporting sessions, and what they contribute that the build does not.]</w:t>
       </w:r>
     </w:p>
     <w:p>
@@ -1364,7 +1346,7 @@
           <w:rFonts w:ascii="Calibri" w:eastAsia="Calibri" w:hAnsi="Calibri" w:cs="Calibri"/>
           <w:color w:val="2E3742"/>
         </w:rPr>
-        <w:t xml:space="preserve">[Paragraph connecting the programme to established practice or literature, and naming what has changed.]</w:t>
+        <w:t>[Paragraph connecting the programme to established practice or literature, and naming what has changed.]</w:t>
       </w:r>
     </w:p>
     <w:p>
@@ -1400,7 +1382,7 @@
           <w:rFonts w:ascii="Calibri" w:eastAsia="Calibri" w:hAnsi="Calibri" w:cs="Calibri"/>
           <w:color w:val="2E3742"/>
         </w:rPr>
-        <w:t xml:space="preserve">[Who the programme is for — disciplines, career stage, and the capability gap it closes. State any assumed background, or that none is assumed.]</w:t>
+        <w:t>[Who the programme is for — disciplines, career stage, and the capability gap it closes. State any assumed background, or that none is assumed.]</w:t>
       </w:r>
     </w:p>
     <w:p>
@@ -1413,7 +1395,7 @@
           <w:rFonts w:ascii="Calibri" w:eastAsia="Calibri" w:hAnsi="Calibri" w:cs="Calibri"/>
           <w:color w:val="2E3742"/>
         </w:rPr>
-        <w:t xml:space="preserve">[Eligibility, registration format, and whether participants work individually or in teams. Note any discounts or institutional arrangements.]</w:t>
+        <w:t>[Eligibility, registration format, and whether participants work individually or in teams. Note any discounts or institutional arrangements.]</w:t>
       </w:r>
     </w:p>
     <w:p>
@@ -1459,12 +1441,6 @@
         <w:gridCol w:w="4873"/>
       </w:tblGrid>
       <w:tr>
-        <w:tblPrEx>
-          <w:tblCellMar>
-            <w:top w:w="0" w:type="dxa"/>
-            <w:bottom w:w="0" w:type="dxa"/>
-          </w:tblCellMar>
-        </w:tblPrEx>
         <w:tc>
           <w:tcPr>
             <w:tcW w:w="4873" w:type="dxa"/>
@@ -1502,7 +1478,7 @@
                 <w:sz w:val="19"/>
                 <w:szCs w:val="19"/>
               </w:rPr>
-              <w:t xml:space="preserve">[Take-away 1 — the central artefact participants build and keep]</w:t>
+              <w:t>[Take-away 1 — the central artefact participants build and keep]</w:t>
             </w:r>
           </w:p>
           <w:p>
@@ -1526,7 +1502,7 @@
                 <w:sz w:val="19"/>
                 <w:szCs w:val="19"/>
               </w:rPr>
-              <w:t xml:space="preserve">[Take-away 2 — a second tangible output]</w:t>
+              <w:t>[Take-away 2 — a second tangible output]</w:t>
             </w:r>
           </w:p>
           <w:p>
@@ -1550,7 +1526,7 @@
                 <w:sz w:val="19"/>
                 <w:szCs w:val="19"/>
               </w:rPr>
-              <w:t xml:space="preserve">[Take-away 3 — a practical command or capability gained]</w:t>
+              <w:t>[Take-away 3 — a practical command or capability gained]</w:t>
             </w:r>
           </w:p>
         </w:tc>
@@ -1591,7 +1567,7 @@
                 <w:sz w:val="19"/>
                 <w:szCs w:val="19"/>
               </w:rPr>
-              <w:t xml:space="preserve">[Take-away 4 — a method or working practice]</w:t>
+              <w:t>[Take-away 4 — a method or working practice]</w:t>
             </w:r>
           </w:p>
           <w:p>
@@ -1615,7 +1591,7 @@
                 <w:sz w:val="19"/>
                 <w:szCs w:val="19"/>
               </w:rPr>
-              <w:t xml:space="preserve">[Take-away 5 — a conceptual understanding they can defend]</w:t>
+              <w:t>[Take-away 5 — a conceptual understanding they can defend]</w:t>
             </w:r>
           </w:p>
           <w:p>
@@ -1639,7 +1615,7 @@
                 <w:sz w:val="19"/>
                 <w:szCs w:val="19"/>
               </w:rPr>
-              <w:t xml:space="preserve">[Take-away 6 — something reusable after the programme ends]</w:t>
+              <w:t>[Take-away 6 — something reusable after the programme ends]</w:t>
             </w:r>
           </w:p>
         </w:tc>
@@ -1704,12 +1680,6 @@
         <w:gridCol w:w="4873"/>
       </w:tblGrid>
       <w:tr>
-        <w:tblPrEx>
-          <w:tblCellMar>
-            <w:top w:w="0" w:type="dxa"/>
-            <w:bottom w:w="0" w:type="dxa"/>
-          </w:tblCellMar>
-        </w:tblPrEx>
         <w:tc>
           <w:tcPr>
             <w:tcW w:w="4873" w:type="dxa"/>
@@ -1747,7 +1717,7 @@
                 <w:sz w:val="19"/>
                 <w:szCs w:val="19"/>
               </w:rPr>
-              <w:t xml:space="preserve">[Requirement participants must arrange themselves, with a note on why it matters]</w:t>
+              <w:t>[Requirement participants must arrange themselves, with a note on why it matters]</w:t>
             </w:r>
           </w:p>
           <w:p>
@@ -1771,7 +1741,7 @@
                 <w:sz w:val="19"/>
                 <w:szCs w:val="19"/>
               </w:rPr>
-              <w:t xml:space="preserve">[Requirement 2]</w:t>
+              <w:t>[Requirement 2]</w:t>
             </w:r>
           </w:p>
           <w:p>
@@ -1795,7 +1765,7 @@
                 <w:sz w:val="19"/>
                 <w:szCs w:val="19"/>
               </w:rPr>
-              <w:t xml:space="preserve">[Requirement 3]</w:t>
+              <w:t>[Requirement 3]</w:t>
             </w:r>
           </w:p>
         </w:tc>
@@ -1836,7 +1806,7 @@
                 <w:sz w:val="19"/>
                 <w:szCs w:val="19"/>
               </w:rPr>
-              <w:t xml:space="preserve">[Requirement 4]</w:t>
+              <w:t>[Requirement 4]</w:t>
             </w:r>
           </w:p>
           <w:p>
@@ -1860,7 +1830,7 @@
                 <w:sz w:val="19"/>
                 <w:szCs w:val="19"/>
               </w:rPr>
-              <w:t xml:space="preserve">[Requirement 5]</w:t>
+              <w:t>[Requirement 5]</w:t>
             </w:r>
           </w:p>
         </w:tc>
@@ -1904,12 +1874,6 @@
         <w:gridCol w:w="4873"/>
       </w:tblGrid>
       <w:tr>
-        <w:tblPrEx>
-          <w:tblCellMar>
-            <w:top w:w="0" w:type="dxa"/>
-            <w:bottom w:w="0" w:type="dxa"/>
-          </w:tblCellMar>
-        </w:tblPrEx>
         <w:tc>
           <w:tcPr>
             <w:tcW w:w="4873" w:type="dxa"/>
@@ -1947,7 +1911,7 @@
                 <w:sz w:val="19"/>
                 <w:szCs w:val="19"/>
               </w:rPr>
-              <w:t xml:space="preserve">[Material supplied in advance, and what participants should do with it]</w:t>
+              <w:t>[Material supplied in advance, and what participants should do with it]</w:t>
             </w:r>
           </w:p>
           <w:p>
@@ -1971,7 +1935,7 @@
                 <w:sz w:val="19"/>
                 <w:szCs w:val="19"/>
               </w:rPr>
-              <w:t xml:space="preserve">[Material supplied in advance 2]</w:t>
+              <w:t>[Material supplied in advance 2]</w:t>
             </w:r>
           </w:p>
         </w:tc>
@@ -2012,7 +1976,7 @@
                 <w:sz w:val="19"/>
                 <w:szCs w:val="19"/>
               </w:rPr>
-              <w:t xml:space="preserve">[Material supplied in advance 3]</w:t>
+              <w:t>[Material supplied in advance 3]</w:t>
             </w:r>
           </w:p>
           <w:p>
@@ -2036,7 +2000,7 @@
                 <w:sz w:val="19"/>
                 <w:szCs w:val="19"/>
               </w:rPr>
-              <w:t xml:space="preserve">[Material supplied in advance 4]</w:t>
+              <w:t>[Material supplied in advance 4]</w:t>
             </w:r>
           </w:p>
         </w:tc>
@@ -2072,7 +2036,7 @@
             <w:szCs w:val="19"/>
             <w:u w:val="single"/>
           </w:rPr>
-          <w:t xml:space="preserve">[link.example.com]</w:t>
+          <w:t>[link.example.com]</w:t>
         </w:r>
       </w:hyperlink>
     </w:p>
@@ -2086,7 +2050,7 @@
           <w:rFonts w:ascii="Calibri" w:eastAsia="Calibri" w:hAnsi="Calibri" w:cs="Calibri"/>
           <w:color w:val="2E3742"/>
         </w:rPr>
-        <w:t xml:space="preserve">[Paragraph explaining why the supplied reference material matters to the design — what it lets you teach that a clean demonstration would not.]</w:t>
+        <w:t>[Paragraph explaining why the supplied reference material matters to the design — what it lets you teach that a clean demonstration would not.]</w:t>
       </w:r>
     </w:p>
     <w:p>
@@ -2134,12 +2098,6 @@
         <w:gridCol w:w="6846"/>
       </w:tblGrid>
       <w:tr>
-        <w:tblPrEx>
-          <w:tblCellMar>
-            <w:top w:w="0" w:type="dxa"/>
-            <w:bottom w:w="0" w:type="dxa"/>
-          </w:tblCellMar>
-        </w:tblPrEx>
         <w:trPr>
           <w:tblHeader/>
         </w:trPr>
@@ -2217,12 +2175,6 @@
         </w:tc>
       </w:tr>
       <w:tr>
-        <w:tblPrEx>
-          <w:tblCellMar>
-            <w:top w:w="0" w:type="dxa"/>
-            <w:bottom w:w="0" w:type="dxa"/>
-          </w:tblCellMar>
-        </w:tblPrEx>
         <w:trPr>
           <w:cantSplit/>
         </w:trPr>
@@ -2288,18 +2240,12 @@
                 <w:sz w:val="19"/>
                 <w:szCs w:val="19"/>
               </w:rPr>
-              <w:t xml:space="preserve">[Who hosts, and what they carry — inaugural address, closing remarks, certificates.]</w:t>
+              <w:t>[Who hosts, and what they carry — inaugural address, closing remarks, certificates.]</w:t>
             </w:r>
           </w:p>
         </w:tc>
       </w:tr>
       <w:tr>
-        <w:tblPrEx>
-          <w:tblCellMar>
-            <w:top w:w="0" w:type="dxa"/>
-            <w:bottom w:w="0" w:type="dxa"/>
-          </w:tblCellMar>
-        </w:tblPrEx>
         <w:trPr>
           <w:cantSplit/>
         </w:trPr>
@@ -2365,18 +2311,12 @@
                 <w:sz w:val="19"/>
                 <w:szCs w:val="19"/>
               </w:rPr>
-              <w:t xml:space="preserve">[Name, designation, affiliation. What they lead and the basis for it.]</w:t>
+              <w:t>[Name, designation, affiliation. What they lead and the basis for it.]</w:t>
             </w:r>
           </w:p>
         </w:tc>
       </w:tr>
       <w:tr>
-        <w:tblPrEx>
-          <w:tblCellMar>
-            <w:top w:w="0" w:type="dxa"/>
-            <w:bottom w:w="0" w:type="dxa"/>
-          </w:tblCellMar>
-        </w:tblPrEx>
         <w:trPr>
           <w:cantSplit/>
         </w:trPr>
@@ -2442,18 +2382,12 @@
                 <w:sz w:val="19"/>
                 <w:szCs w:val="19"/>
               </w:rPr>
-              <w:t xml:space="preserve">[Name, designation, affiliation. Which session they carry.]</w:t>
+              <w:t>[Name, designation, affiliation. Which session they carry.]</w:t>
             </w:r>
           </w:p>
         </w:tc>
       </w:tr>
       <w:tr>
-        <w:tblPrEx>
-          <w:tblCellMar>
-            <w:top w:w="0" w:type="dxa"/>
-            <w:bottom w:w="0" w:type="dxa"/>
-          </w:tblCellMar>
-        </w:tblPrEx>
         <w:trPr>
           <w:cantSplit/>
         </w:trPr>
@@ -2487,7 +2421,7 @@
                 <w:sz w:val="19"/>
                 <w:szCs w:val="19"/>
               </w:rPr>
-              <w:t xml:space="preserve">External - Day 1</w:t>
+              <w:t>External - Day 1</w:t>
             </w:r>
           </w:p>
         </w:tc>
@@ -2519,18 +2453,12 @@
                 <w:sz w:val="19"/>
                 <w:szCs w:val="19"/>
               </w:rPr>
-              <w:t xml:space="preserve">[Topic area for the Day 1 external speaker.]</w:t>
+              <w:t>[Topic area for the Day 1 external speaker.]</w:t>
             </w:r>
           </w:p>
         </w:tc>
       </w:tr>
       <w:tr>
-        <w:tblPrEx>
-          <w:tblCellMar>
-            <w:top w:w="0" w:type="dxa"/>
-            <w:bottom w:w="0" w:type="dxa"/>
-          </w:tblCellMar>
-        </w:tblPrEx>
         <w:trPr>
           <w:cantSplit/>
         </w:trPr>
@@ -2564,7 +2492,7 @@
                 <w:sz w:val="19"/>
                 <w:szCs w:val="19"/>
               </w:rPr>
-              <w:t xml:space="preserve">External - Day 2</w:t>
+              <w:t>External - Day 2</w:t>
             </w:r>
           </w:p>
         </w:tc>
@@ -2596,18 +2524,12 @@
                 <w:sz w:val="19"/>
                 <w:szCs w:val="19"/>
               </w:rPr>
-              <w:t xml:space="preserve">[Topic area for the Day 2 external speaker.]</w:t>
+              <w:t>[Topic area for the Day 2 external speaker.]</w:t>
             </w:r>
           </w:p>
         </w:tc>
       </w:tr>
       <w:tr>
-        <w:tblPrEx>
-          <w:tblCellMar>
-            <w:top w:w="0" w:type="dxa"/>
-            <w:bottom w:w="0" w:type="dxa"/>
-          </w:tblCellMar>
-        </w:tblPrEx>
         <w:trPr>
           <w:cantSplit/>
         </w:trPr>
@@ -2673,18 +2595,12 @@
                 <w:sz w:val="19"/>
                 <w:szCs w:val="19"/>
               </w:rPr>
-              <w:t xml:space="preserve">[Optional clinics or platform sessions, and where they would come from.]</w:t>
+              <w:t>[Optional clinics or platform sessions, and where they would come from.]</w:t>
             </w:r>
           </w:p>
         </w:tc>
       </w:tr>
       <w:tr>
-        <w:tblPrEx>
-          <w:tblCellMar>
-            <w:top w:w="0" w:type="dxa"/>
-            <w:bottom w:w="0" w:type="dxa"/>
-          </w:tblCellMar>
-        </w:tblPrEx>
         <w:trPr>
           <w:cantSplit/>
         </w:trPr>
@@ -2750,7 +2666,27 @@
                 <w:sz w:val="19"/>
                 <w:szCs w:val="19"/>
               </w:rPr>
-              <w:t xml:space="preserve">[Who provides floor support during hands-on sessions, and at what ratio.]</w:t>
+              <w:t xml:space="preserve">[Who provides floor support during hands-on sessions, and at what </w:t>
+            </w:r>
+            <w:proofErr w:type="gramStart"/>
+            <w:r>
+              <w:rPr>
+                <w:rFonts w:ascii="Calibri" w:eastAsia="Calibri" w:hAnsi="Calibri" w:cs="Calibri"/>
+                <w:color w:val="2E3742"/>
+                <w:sz w:val="19"/>
+                <w:szCs w:val="19"/>
+              </w:rPr>
+              <w:t>ratio.</w:t>
+            </w:r>
+            <w:proofErr w:type="gramEnd"/>
+            <w:r>
+              <w:rPr>
+                <w:rFonts w:ascii="Calibri" w:eastAsia="Calibri" w:hAnsi="Calibri" w:cs="Calibri"/>
+                <w:color w:val="2E3742"/>
+                <w:sz w:val="19"/>
+                <w:szCs w:val="19"/>
+              </w:rPr>
+              <w:t>]</w:t>
             </w:r>
           </w:p>
         </w:tc>
@@ -2771,7 +2707,7 @@
           <w:rFonts w:ascii="Calibri" w:eastAsia="Calibri" w:hAnsi="Calibri" w:cs="Calibri"/>
           <w:color w:val="2E3742"/>
         </w:rPr>
-        <w:t xml:space="preserve">[Paragraph on the facilitation model and why it is structured this way.]</w:t>
+        <w:t>[Paragraph on the facilitation model and why it is structured this way.]</w:t>
       </w:r>
     </w:p>
     <w:p>
@@ -2784,7 +2720,7 @@
           <w:rFonts w:ascii="Calibri" w:eastAsia="Calibri" w:hAnsi="Calibri" w:cs="Calibri"/>
           <w:color w:val="2E3742"/>
         </w:rPr>
-        <w:t xml:space="preserve">[Paragraph on a key resource person — what they bring and which part of the programme it serves.]</w:t>
+        <w:t>[Paragraph on a key resource person — what they bring and which part of the programme it serves.]</w:t>
       </w:r>
     </w:p>
     <w:p>
@@ -2797,7 +2733,7 @@
           <w:rFonts w:ascii="Calibri" w:eastAsia="Calibri" w:hAnsi="Calibri" w:cs="Calibri"/>
           <w:color w:val="2E3742"/>
         </w:rPr>
-        <w:t xml:space="preserve">[Paragraph on support roles and why they are not optional to delivery.]</w:t>
+        <w:t>[Paragraph on support roles and why they are not optional to delivery.]</w:t>
       </w:r>
     </w:p>
     <w:p>
@@ -2844,7 +2780,7 @@
           <w:rFonts w:ascii="Calibri" w:eastAsia="Calibri" w:hAnsi="Calibri" w:cs="Calibri"/>
           <w:color w:val="2E3742"/>
         </w:rPr>
-        <w:t xml:space="preserve">[One line on daily timing and the split between taught sessions and hands-on work.]</w:t>
+        <w:t>[One line on daily timing and the split between taught sessions and hands-on work.]</w:t>
       </w:r>
     </w:p>
     <w:p>
@@ -2885,7 +2821,7 @@
           <w:sz w:val="22"/>
           <w:szCs w:val="22"/>
         </w:rPr>
-        <w:t xml:space="preserve">[Day One Theme]</w:t>
+        <w:t>[Day One Theme]</w:t>
       </w:r>
     </w:p>
     <w:p>
@@ -2903,7 +2839,35 @@
           <w:sz w:val="16"/>
           <w:szCs w:val="16"/>
         </w:rPr>
-        <w:t xml:space="preserve">[Duration: 0 hours  ·  0 sessions  ·  0 builds]</w:t>
+        <w:t xml:space="preserve">[Duration: 0 </w:t>
+      </w:r>
+      <w:proofErr w:type="gramStart"/>
+      <w:r>
+        <w:rPr>
+          <w:rFonts w:ascii="Calibri" w:eastAsia="Calibri" w:hAnsi="Calibri" w:cs="Calibri"/>
+          <w:b/>
+          <w:bCs/>
+          <w:caps/>
+          <w:color w:val="B8892B"/>
+          <w:spacing w:val="24"/>
+          <w:sz w:val="16"/>
+          <w:szCs w:val="16"/>
+        </w:rPr>
+        <w:t>hours  ·</w:t>
+      </w:r>
+      <w:proofErr w:type="gramEnd"/>
+      <w:r>
+        <w:rPr>
+          <w:rFonts w:ascii="Calibri" w:eastAsia="Calibri" w:hAnsi="Calibri" w:cs="Calibri"/>
+          <w:b/>
+          <w:bCs/>
+          <w:caps/>
+          <w:color w:val="B8892B"/>
+          <w:spacing w:val="24"/>
+          <w:sz w:val="16"/>
+          <w:szCs w:val="16"/>
+        </w:rPr>
+        <w:t xml:space="preserve">  0 sessions  ·  0 builds]</w:t>
       </w:r>
     </w:p>
     <w:tbl>
@@ -2930,12 +2894,6 @@
         <w:gridCol w:w="2678"/>
       </w:tblGrid>
       <w:tr>
-        <w:tblPrEx>
-          <w:tblCellMar>
-            <w:top w:w="0" w:type="dxa"/>
-            <w:bottom w:w="0" w:type="dxa"/>
-          </w:tblCellMar>
-        </w:tblPrEx>
         <w:trPr>
           <w:tblHeader/>
         </w:trPr>
@@ -3085,12 +3043,6 @@
         </w:tc>
       </w:tr>
       <w:tr>
-        <w:tblPrEx>
-          <w:tblCellMar>
-            <w:top w:w="0" w:type="dxa"/>
-            <w:bottom w:w="0" w:type="dxa"/>
-          </w:tblCellMar>
-        </w:tblPrEx>
         <w:trPr>
           <w:cantSplit/>
         </w:trPr>
@@ -3124,7 +3076,7 @@
                 <w:sz w:val="18"/>
                 <w:szCs w:val="18"/>
               </w:rPr>
-              <w:t xml:space="preserve">[0:00 - 0:00 AM]</w:t>
+              <w:t>[0:00 - 0:00 AM]</w:t>
             </w:r>
           </w:p>
         </w:tc>
@@ -3176,7 +3128,7 @@
                 <w:sz w:val="19"/>
                 <w:szCs w:val="19"/>
               </w:rPr>
-              <w:t xml:space="preserve">[Session title]</w:t>
+              <w:t>[Session title]</w:t>
             </w:r>
           </w:p>
         </w:tc>
@@ -3208,7 +3160,7 @@
                 <w:sz w:val="18"/>
                 <w:szCs w:val="18"/>
               </w:rPr>
-              <w:t xml:space="preserve">[What happens in this session — the substance, what participants do, and what it sets up for the sessions that follow.]</w:t>
+              <w:t>[What happens in this session — the substance, what participants do, and what it sets up for the sessions that follow.]</w:t>
             </w:r>
           </w:p>
         </w:tc>
@@ -3242,18 +3194,12 @@
                 <w:sz w:val="17"/>
                 <w:szCs w:val="17"/>
               </w:rPr>
-              <w:t xml:space="preserve">[Facilitator]</w:t>
+              <w:t>[Facilitator]</w:t>
             </w:r>
           </w:p>
         </w:tc>
       </w:tr>
       <w:tr>
-        <w:tblPrEx>
-          <w:tblCellMar>
-            <w:top w:w="0" w:type="dxa"/>
-            <w:bottom w:w="0" w:type="dxa"/>
-          </w:tblCellMar>
-        </w:tblPrEx>
         <w:trPr>
           <w:cantSplit/>
         </w:trPr>
@@ -3287,7 +3233,7 @@
                 <w:sz w:val="18"/>
                 <w:szCs w:val="18"/>
               </w:rPr>
-              <w:t xml:space="preserve">[0:00 - 0:00 AM]</w:t>
+              <w:t>[0:00 - 0:00 AM]</w:t>
             </w:r>
           </w:p>
         </w:tc>
@@ -3339,7 +3285,7 @@
                 <w:sz w:val="19"/>
                 <w:szCs w:val="19"/>
               </w:rPr>
-              <w:t xml:space="preserve">[Session title]</w:t>
+              <w:t>[Session title]</w:t>
             </w:r>
           </w:p>
         </w:tc>
@@ -3371,7 +3317,7 @@
                 <w:sz w:val="18"/>
                 <w:szCs w:val="18"/>
               </w:rPr>
-              <w:t xml:space="preserve">[What happens in this session — the substance, what participants do, and what it sets up for the sessions that follow.]</w:t>
+              <w:t>[What happens in this session — the substance, what participants do, and what it sets up for the sessions that follow.]</w:t>
             </w:r>
           </w:p>
         </w:tc>
@@ -3405,18 +3351,12 @@
                 <w:sz w:val="17"/>
                 <w:szCs w:val="17"/>
               </w:rPr>
-              <w:t xml:space="preserve">[Facilitator]</w:t>
+              <w:t>[Facilitator]</w:t>
             </w:r>
           </w:p>
         </w:tc>
       </w:tr>
       <w:tr>
-        <w:tblPrEx>
-          <w:tblCellMar>
-            <w:top w:w="0" w:type="dxa"/>
-            <w:bottom w:w="0" w:type="dxa"/>
-          </w:tblCellMar>
-        </w:tblPrEx>
         <w:trPr>
           <w:cantSplit/>
         </w:trPr>
@@ -3450,7 +3390,7 @@
                 <w:sz w:val="17"/>
                 <w:szCs w:val="17"/>
               </w:rPr>
-              <w:t xml:space="preserve">[0:00 - 0:00 AM]</w:t>
+              <w:t>[0:00 - 0:00 AM]</w:t>
             </w:r>
           </w:p>
         </w:tc>
@@ -3538,12 +3478,6 @@
         </w:tc>
       </w:tr>
       <w:tr>
-        <w:tblPrEx>
-          <w:tblCellMar>
-            <w:top w:w="0" w:type="dxa"/>
-            <w:bottom w:w="0" w:type="dxa"/>
-          </w:tblCellMar>
-        </w:tblPrEx>
         <w:trPr>
           <w:cantSplit/>
         </w:trPr>
@@ -3577,8 +3511,7 @@
                 <w:sz w:val="18"/>
                 <w:szCs w:val="18"/>
               </w:rPr>
-              <w:lastRenderedPageBreak/>
-              <w:t xml:space="preserve">[0:00 - 0:00 AM]</w:t>
+              <w:t>[0:00 - 0:00 AM]</w:t>
             </w:r>
           </w:p>
         </w:tc>
@@ -3630,7 +3563,7 @@
                 <w:sz w:val="19"/>
                 <w:szCs w:val="19"/>
               </w:rPr>
-              <w:t xml:space="preserve">[Session title]</w:t>
+              <w:t>[Session title]</w:t>
             </w:r>
           </w:p>
         </w:tc>
@@ -3662,7 +3595,7 @@
                 <w:sz w:val="18"/>
                 <w:szCs w:val="18"/>
               </w:rPr>
-              <w:t xml:space="preserve">[What happens in this session — the substance, what participants do, and what it sets up for the sessions that follow.]</w:t>
+              <w:t>[What happens in this session — the substance, what participants do, and what it sets up for the sessions that follow.]</w:t>
             </w:r>
           </w:p>
         </w:tc>
@@ -3696,7 +3629,7 @@
                 <w:sz w:val="17"/>
                 <w:szCs w:val="17"/>
               </w:rPr>
-              <w:t xml:space="preserve">[Facilitator]</w:t>
+              <w:t>[Facilitator]</w:t>
             </w:r>
           </w:p>
         </w:tc>
@@ -3729,12 +3662,6 @@
         <w:gridCol w:w="12778"/>
       </w:tblGrid>
       <w:tr>
-        <w:tblPrEx>
-          <w:tblCellMar>
-            <w:top w:w="0" w:type="dxa"/>
-            <w:bottom w:w="0" w:type="dxa"/>
-          </w:tblCellMar>
-        </w:tblPrEx>
         <w:trPr>
           <w:cantSplit/>
         </w:trPr>
@@ -3802,18 +3729,12 @@
                 <w:sz w:val="18"/>
                 <w:szCs w:val="18"/>
               </w:rPr>
-              <w:t xml:space="preserve">[What participants can do by the end of the day, stated as capability.]</w:t>
+              <w:t>[What participants can do by the end of the day, stated as capability.]</w:t>
             </w:r>
           </w:p>
         </w:tc>
       </w:tr>
       <w:tr>
-        <w:tblPrEx>
-          <w:tblCellMar>
-            <w:top w:w="0" w:type="dxa"/>
-            <w:bottom w:w="0" w:type="dxa"/>
-          </w:tblCellMar>
-        </w:tblPrEx>
         <w:trPr>
           <w:cantSplit/>
         </w:trPr>
@@ -3881,7 +3802,7 @@
                 <w:sz w:val="18"/>
                 <w:szCs w:val="18"/>
               </w:rPr>
-              <w:t xml:space="preserve">[The tangible artefact produced by the end of the day.]</w:t>
+              <w:t>[The tangible artefact produced by the end of the day.]</w:t>
             </w:r>
           </w:p>
         </w:tc>
@@ -3927,7 +3848,7 @@
           <w:sz w:val="22"/>
           <w:szCs w:val="22"/>
         </w:rPr>
-        <w:t xml:space="preserve">[Day Two Theme]</w:t>
+        <w:t>[Day Two Theme]</w:t>
       </w:r>
     </w:p>
     <w:p>
@@ -3945,7 +3866,35 @@
           <w:sz w:val="16"/>
           <w:szCs w:val="16"/>
         </w:rPr>
-        <w:t xml:space="preserve">[Duration: 0 hours  ·  0 sessions  ·  0 builds]</w:t>
+        <w:t xml:space="preserve">[Duration: 0 </w:t>
+      </w:r>
+      <w:proofErr w:type="gramStart"/>
+      <w:r>
+        <w:rPr>
+          <w:rFonts w:ascii="Calibri" w:eastAsia="Calibri" w:hAnsi="Calibri" w:cs="Calibri"/>
+          <w:b/>
+          <w:bCs/>
+          <w:caps/>
+          <w:color w:val="B8892B"/>
+          <w:spacing w:val="24"/>
+          <w:sz w:val="16"/>
+          <w:szCs w:val="16"/>
+        </w:rPr>
+        <w:t>hours  ·</w:t>
+      </w:r>
+      <w:proofErr w:type="gramEnd"/>
+      <w:r>
+        <w:rPr>
+          <w:rFonts w:ascii="Calibri" w:eastAsia="Calibri" w:hAnsi="Calibri" w:cs="Calibri"/>
+          <w:b/>
+          <w:bCs/>
+          <w:caps/>
+          <w:color w:val="B8892B"/>
+          <w:spacing w:val="24"/>
+          <w:sz w:val="16"/>
+          <w:szCs w:val="16"/>
+        </w:rPr>
+        <w:t xml:space="preserve">  0 sessions  ·  0 builds]</w:t>
       </w:r>
     </w:p>
     <w:tbl>
@@ -3972,12 +3921,6 @@
         <w:gridCol w:w="2678"/>
       </w:tblGrid>
       <w:tr>
-        <w:tblPrEx>
-          <w:tblCellMar>
-            <w:top w:w="0" w:type="dxa"/>
-            <w:bottom w:w="0" w:type="dxa"/>
-          </w:tblCellMar>
-        </w:tblPrEx>
         <w:trPr>
           <w:tblHeader/>
         </w:trPr>
@@ -4127,12 +4070,6 @@
         </w:tc>
       </w:tr>
       <w:tr>
-        <w:tblPrEx>
-          <w:tblCellMar>
-            <w:top w:w="0" w:type="dxa"/>
-            <w:bottom w:w="0" w:type="dxa"/>
-          </w:tblCellMar>
-        </w:tblPrEx>
         <w:trPr>
           <w:cantSplit/>
         </w:trPr>
@@ -4166,7 +4103,7 @@
                 <w:sz w:val="18"/>
                 <w:szCs w:val="18"/>
               </w:rPr>
-              <w:t xml:space="preserve">[0:00 - 0:00 AM]</w:t>
+              <w:t>[0:00 - 0:00 AM]</w:t>
             </w:r>
           </w:p>
         </w:tc>
@@ -4202,7 +4139,7 @@
                 <w:sz w:val="15"/>
                 <w:szCs w:val="15"/>
               </w:rPr>
-              <w:t xml:space="preserve">Session 0</w:t>
+              <w:t>Session 0</w:t>
             </w:r>
           </w:p>
           <w:p>
@@ -4218,7 +4155,7 @@
                 <w:sz w:val="19"/>
                 <w:szCs w:val="19"/>
               </w:rPr>
-              <w:t xml:space="preserve">[Session title]</w:t>
+              <w:t>[Session title]</w:t>
             </w:r>
           </w:p>
         </w:tc>
@@ -4250,7 +4187,7 @@
                 <w:sz w:val="18"/>
                 <w:szCs w:val="18"/>
               </w:rPr>
-              <w:t xml:space="preserve">[What happens in this session — the substance, what participants do, and what it sets up for the sessions that follow.]</w:t>
+              <w:t>[What happens in this session — the substance, what participants do, and what it sets up for the sessions that follow.]</w:t>
             </w:r>
           </w:p>
         </w:tc>
@@ -4284,18 +4221,12 @@
                 <w:sz w:val="17"/>
                 <w:szCs w:val="17"/>
               </w:rPr>
-              <w:t xml:space="preserve">[Facilitator]</w:t>
+              <w:t>[Facilitator]</w:t>
             </w:r>
           </w:p>
         </w:tc>
       </w:tr>
       <w:tr>
-        <w:tblPrEx>
-          <w:tblCellMar>
-            <w:top w:w="0" w:type="dxa"/>
-            <w:bottom w:w="0" w:type="dxa"/>
-          </w:tblCellMar>
-        </w:tblPrEx>
         <w:trPr>
           <w:cantSplit/>
         </w:trPr>
@@ -4329,7 +4260,7 @@
                 <w:sz w:val="17"/>
                 <w:szCs w:val="17"/>
               </w:rPr>
-              <w:t xml:space="preserve">[0:00 - 0:00 AM]</w:t>
+              <w:t>[0:00 - 0:00 AM]</w:t>
             </w:r>
           </w:p>
         </w:tc>
@@ -4417,12 +4348,6 @@
         </w:tc>
       </w:tr>
       <w:tr>
-        <w:tblPrEx>
-          <w:tblCellMar>
-            <w:top w:w="0" w:type="dxa"/>
-            <w:bottom w:w="0" w:type="dxa"/>
-          </w:tblCellMar>
-        </w:tblPrEx>
         <w:trPr>
           <w:cantSplit/>
         </w:trPr>
@@ -4456,7 +4381,7 @@
                 <w:sz w:val="18"/>
                 <w:szCs w:val="18"/>
               </w:rPr>
-              <w:t xml:space="preserve">[0:00 - 0:00 AM]</w:t>
+              <w:t>[0:00 - 0:00 AM]</w:t>
             </w:r>
           </w:p>
         </w:tc>
@@ -4492,7 +4417,7 @@
                 <w:sz w:val="15"/>
                 <w:szCs w:val="15"/>
               </w:rPr>
-              <w:t xml:space="preserve">Session 0</w:t>
+              <w:t>Session 0</w:t>
             </w:r>
           </w:p>
           <w:p>
@@ -4508,7 +4433,7 @@
                 <w:sz w:val="19"/>
                 <w:szCs w:val="19"/>
               </w:rPr>
-              <w:t xml:space="preserve">[Session title]</w:t>
+              <w:t>[Session title]</w:t>
             </w:r>
           </w:p>
         </w:tc>
@@ -4540,7 +4465,7 @@
                 <w:sz w:val="18"/>
                 <w:szCs w:val="18"/>
               </w:rPr>
-              <w:t xml:space="preserve">[What happens in this session — the substance, what participants do, and what it sets up for the sessions that follow.]</w:t>
+              <w:t>[What happens in this session — the substance, what participants do, and what it sets up for the sessions that follow.]</w:t>
             </w:r>
           </w:p>
         </w:tc>
@@ -4574,18 +4499,12 @@
                 <w:sz w:val="17"/>
                 <w:szCs w:val="17"/>
               </w:rPr>
-              <w:t xml:space="preserve">[Facilitator]</w:t>
+              <w:t>[Facilitator]</w:t>
             </w:r>
           </w:p>
         </w:tc>
       </w:tr>
       <w:tr>
-        <w:tblPrEx>
-          <w:tblCellMar>
-            <w:top w:w="0" w:type="dxa"/>
-            <w:bottom w:w="0" w:type="dxa"/>
-          </w:tblCellMar>
-        </w:tblPrEx>
         <w:trPr>
           <w:cantSplit/>
         </w:trPr>
@@ -4619,7 +4538,7 @@
                 <w:sz w:val="18"/>
                 <w:szCs w:val="18"/>
               </w:rPr>
-              <w:t xml:space="preserve">[0:00 - 0:00 PM]</w:t>
+              <w:t>[0:00 - 0:00 PM]</w:t>
             </w:r>
           </w:p>
         </w:tc>
@@ -4671,7 +4590,7 @@
                 <w:sz w:val="19"/>
                 <w:szCs w:val="19"/>
               </w:rPr>
-              <w:t xml:space="preserve">[Closing session title]</w:t>
+              <w:t>[Closing session title]</w:t>
             </w:r>
           </w:p>
         </w:tc>
@@ -4703,7 +4622,7 @@
                 <w:sz w:val="18"/>
                 <w:szCs w:val="18"/>
               </w:rPr>
-              <w:t xml:space="preserve">[Reflection prompt, feedback capture, and certificate distribution.]</w:t>
+              <w:t>[Reflection prompt, feedback capture, and certificate distribution.]</w:t>
             </w:r>
           </w:p>
         </w:tc>
@@ -4737,7 +4656,7 @@
                 <w:sz w:val="17"/>
                 <w:szCs w:val="17"/>
               </w:rPr>
-              <w:t xml:space="preserve">[Facilitator]</w:t>
+              <w:t>[Facilitator]</w:t>
             </w:r>
           </w:p>
         </w:tc>
@@ -4770,12 +4689,6 @@
         <w:gridCol w:w="12778"/>
       </w:tblGrid>
       <w:tr>
-        <w:tblPrEx>
-          <w:tblCellMar>
-            <w:top w:w="0" w:type="dxa"/>
-            <w:bottom w:w="0" w:type="dxa"/>
-          </w:tblCellMar>
-        </w:tblPrEx>
         <w:trPr>
           <w:cantSplit/>
         </w:trPr>
@@ -4811,7 +4724,7 @@
                 <w:sz w:val="15"/>
                 <w:szCs w:val="15"/>
               </w:rPr>
-              <w:t xml:space="preserve">Learning</w:t>
+              <w:t>Learning</w:t>
             </w:r>
           </w:p>
         </w:tc>
@@ -4843,18 +4756,12 @@
                 <w:sz w:val="18"/>
                 <w:szCs w:val="18"/>
               </w:rPr>
-              <w:t xml:space="preserve">[What participants can do by the end of the day, stated as capability.]</w:t>
+              <w:t>[What participants can do by the end of the day, stated as capability.]</w:t>
             </w:r>
           </w:p>
         </w:tc>
       </w:tr>
       <w:tr>
-        <w:tblPrEx>
-          <w:tblCellMar>
-            <w:top w:w="0" w:type="dxa"/>
-            <w:bottom w:w="0" w:type="dxa"/>
-          </w:tblCellMar>
-        </w:tblPrEx>
         <w:trPr>
           <w:cantSplit/>
         </w:trPr>
@@ -4922,7 +4829,7 @@
                 <w:sz w:val="18"/>
                 <w:szCs w:val="18"/>
               </w:rPr>
-              <w:t xml:space="preserve">[The tangible artefact produced by the end of the day.]</w:t>
+              <w:t>[The tangible artefact produced by the end of the day.]</w:t>
             </w:r>
           </w:p>
         </w:tc>
@@ -4984,12 +4891,6 @@
         <w:gridCol w:w="7146"/>
       </w:tblGrid>
       <w:tr>
-        <w:tblPrEx>
-          <w:tblCellMar>
-            <w:top w:w="0" w:type="dxa"/>
-            <w:bottom w:w="0" w:type="dxa"/>
-          </w:tblCellMar>
-        </w:tblPrEx>
         <w:trPr>
           <w:tblHeader/>
         </w:trPr>
@@ -5067,12 +4968,6 @@
         </w:tc>
       </w:tr>
       <w:tr>
-        <w:tblPrEx>
-          <w:tblCellMar>
-            <w:top w:w="0" w:type="dxa"/>
-            <w:bottom w:w="0" w:type="dxa"/>
-          </w:tblCellMar>
-        </w:tblPrEx>
         <w:trPr>
           <w:cantSplit/>
         </w:trPr>
@@ -5138,18 +5033,12 @@
                 <w:sz w:val="19"/>
                 <w:szCs w:val="19"/>
               </w:rPr>
-              <w:t xml:space="preserve">[Room type and physical setup required.]</w:t>
+              <w:t>[Room type and physical setup required.]</w:t>
             </w:r>
           </w:p>
         </w:tc>
       </w:tr>
       <w:tr>
-        <w:tblPrEx>
-          <w:tblCellMar>
-            <w:top w:w="0" w:type="dxa"/>
-            <w:bottom w:w="0" w:type="dxa"/>
-          </w:tblCellMar>
-        </w:tblPrEx>
         <w:trPr>
           <w:cantSplit/>
         </w:trPr>
@@ -5215,18 +5104,12 @@
                 <w:sz w:val="19"/>
                 <w:szCs w:val="19"/>
               </w:rPr>
-              <w:t xml:space="preserve">[Power and charging requirements at every seat.]</w:t>
+              <w:t>[Power and charging requirements at every seat.]</w:t>
             </w:r>
           </w:p>
         </w:tc>
       </w:tr>
       <w:tr>
-        <w:tblPrEx>
-          <w:tblCellMar>
-            <w:top w:w="0" w:type="dxa"/>
-            <w:bottom w:w="0" w:type="dxa"/>
-          </w:tblCellMar>
-        </w:tblPrEx>
         <w:trPr>
           <w:cantSplit/>
         </w:trPr>
@@ -5292,18 +5175,12 @@
                 <w:sz w:val="19"/>
                 <w:szCs w:val="19"/>
               </w:rPr>
-              <w:t xml:space="preserve">[Bandwidth and network requirements for the full cohort at once.]</w:t>
+              <w:t>[Bandwidth and network requirements for the full cohort at once.]</w:t>
             </w:r>
           </w:p>
         </w:tc>
       </w:tr>
       <w:tr>
-        <w:tblPrEx>
-          <w:tblCellMar>
-            <w:top w:w="0" w:type="dxa"/>
-            <w:bottom w:w="0" w:type="dxa"/>
-          </w:tblCellMar>
-        </w:tblPrEx>
         <w:trPr>
           <w:cantSplit/>
         </w:trPr>
@@ -5369,18 +5246,12 @@
                 <w:sz w:val="19"/>
                 <w:szCs w:val="19"/>
               </w:rPr>
-              <w:t xml:space="preserve">[Camera, audio, and remote-participant support arrangements.]</w:t>
+              <w:t>[Camera, audio, and remote-participant support arrangements.]</w:t>
             </w:r>
           </w:p>
         </w:tc>
       </w:tr>
       <w:tr>
-        <w:tblPrEx>
-          <w:tblCellMar>
-            <w:top w:w="0" w:type="dxa"/>
-            <w:bottom w:w="0" w:type="dxa"/>
-          </w:tblCellMar>
-        </w:tblPrEx>
         <w:trPr>
           <w:cantSplit/>
         </w:trPr>
@@ -5446,18 +5317,12 @@
                 <w:sz w:val="19"/>
                 <w:szCs w:val="19"/>
               </w:rPr>
-              <w:t xml:space="preserve">[What must be prepared and tested in advance, and by when.]</w:t>
+              <w:t>[What must be prepared and tested in advance, and by when.]</w:t>
             </w:r>
           </w:p>
         </w:tc>
       </w:tr>
       <w:tr>
-        <w:tblPrEx>
-          <w:tblCellMar>
-            <w:top w:w="0" w:type="dxa"/>
-            <w:bottom w:w="0" w:type="dxa"/>
-          </w:tblCellMar>
-        </w:tblPrEx>
         <w:trPr>
           <w:cantSplit/>
         </w:trPr>
@@ -5523,7 +5388,7 @@
                 <w:sz w:val="19"/>
                 <w:szCs w:val="19"/>
               </w:rPr>
-              <w:t xml:space="preserve">[Participant packs, name plates, certificates, and any other materials.]</w:t>
+              <w:t>[Participant packs, name plates, certificates, and any other materials.]</w:t>
             </w:r>
           </w:p>
         </w:tc>
@@ -5556,12 +5421,6 @@
         <w:gridCol w:w="7846"/>
       </w:tblGrid>
       <w:tr>
-        <w:tblPrEx>
-          <w:tblCellMar>
-            <w:top w:w="0" w:type="dxa"/>
-            <w:bottom w:w="0" w:type="dxa"/>
-          </w:tblCellMar>
-        </w:tblPrEx>
         <w:trPr>
           <w:cantSplit/>
         </w:trPr>
@@ -5629,7 +5488,7 @@
                 <w:sz w:val="19"/>
                 <w:szCs w:val="19"/>
               </w:rPr>
-              <w:t xml:space="preserve">[A short note flagging the single largest dependency or delivery risk.]</w:t>
+              <w:t>[A short note flagging the single largest dependency or delivery risk.]</w:t>
             </w:r>
           </w:p>
         </w:tc>
@@ -5668,7 +5527,7 @@
           <w:rFonts w:ascii="Calibri" w:eastAsia="Calibri" w:hAnsi="Calibri" w:cs="Calibri"/>
           <w:color w:val="2E3742"/>
         </w:rPr>
-        <w:t xml:space="preserve">[Why the obvious metrics — attendance, satisfaction scores — will not tell you whether this worked, and what will be tracked instead.]</w:t>
+        <w:t>[Why the obvious metrics — attendance, satisfaction scores — will not tell you whether this worked, and what will be tracked instead.]</w:t>
       </w:r>
     </w:p>
     <w:p>
@@ -5700,7 +5559,7 @@
           <w:rFonts w:ascii="Calibri" w:eastAsia="Calibri" w:hAnsi="Calibri" w:cs="Calibri"/>
           <w:color w:val="2E3742"/>
         </w:rPr>
-        <w:t xml:space="preserve">[How it is observed, and what counts as evidence.]</w:t>
+        <w:t>[How it is observed, and what counts as evidence.]</w:t>
       </w:r>
     </w:p>
     <w:p>
@@ -5732,7 +5591,7 @@
           <w:rFonts w:ascii="Calibri" w:eastAsia="Calibri" w:hAnsi="Calibri" w:cs="Calibri"/>
           <w:color w:val="2E3742"/>
         </w:rPr>
-        <w:t xml:space="preserve">[How it is observed, and what counts as evidence.]</w:t>
+        <w:t>[How it is observed, and what counts as evidence.]</w:t>
       </w:r>
     </w:p>
     <w:p>
@@ -5764,7 +5623,7 @@
           <w:rFonts w:ascii="Calibri" w:eastAsia="Calibri" w:hAnsi="Calibri" w:cs="Calibri"/>
           <w:color w:val="2E3742"/>
         </w:rPr>
-        <w:t xml:space="preserve">[How it is observed, and what counts as evidence.]</w:t>
+        <w:t>[How it is observed, and what counts as evidence.]</w:t>
       </w:r>
     </w:p>
     <w:p>
@@ -5798,7 +5657,7 @@
           <w:rFonts w:ascii="Calibri" w:eastAsia="Calibri" w:hAnsi="Calibri" w:cs="Calibri"/>
           <w:color w:val="2E3742"/>
         </w:rPr>
-        <w:t xml:space="preserve">[How this programme fits the wider calendar, strategy or mandate — what stream it belongs to, and what it contributes that the others do not.]</w:t>
+        <w:t>[How this programme fits the wider calendar, strategy or mandate — what stream it belongs to, and what it contributes that the others do not.]</w:t>
       </w:r>
     </w:p>
     <w:p>
@@ -5820,6 +5679,7 @@
         </w:pBdr>
         <w:spacing w:before="460" w:after="220" w:line="300" w:lineRule="auto"/>
       </w:pPr>
+      <w:proofErr w:type="gramStart"/>
       <w:r>
         <w:rPr>
           <w:rFonts w:ascii="Georgia" w:eastAsia="Georgia" w:hAnsi="Georgia" w:cs="Georgia"/>
@@ -5832,7 +5692,21 @@
           <w:szCs w:val="25"/>
         </w:rPr>
         <w:lastRenderedPageBreak/>
-        <w:t>Annexe  ·  Potential External Speakers</w:t>
+        <w:t>Annexe  ·</w:t>
+      </w:r>
+      <w:proofErr w:type="gramEnd"/>
+      <w:r>
+        <w:rPr>
+          <w:rFonts w:ascii="Georgia" w:eastAsia="Georgia" w:hAnsi="Georgia" w:cs="Georgia"/>
+          <w:b/>
+          <w:bCs/>
+          <w:caps/>
+          <w:color w:val="1B3B66"/>
+          <w:spacing w:val="30"/>
+          <w:sz w:val="25"/>
+          <w:szCs w:val="25"/>
+        </w:rPr>
+        <w:t xml:space="preserve">  Potential External Speakers</w:t>
       </w:r>
     </w:p>
     <w:p>
@@ -5847,7 +5721,7 @@
           <w:sz w:val="19"/>
           <w:szCs w:val="19"/>
         </w:rPr>
-        <w:t xml:space="preserve">[Explain the purpose of this annexe: how many external slots exist, what they are for, and how this list should be read.]</w:t>
+        <w:t>[Explain the purpose of this annexe: how many external slots exist, what they are for, and how this list should be read.]</w:t>
       </w:r>
     </w:p>
     <w:p>
@@ -5863,7 +5737,7 @@
           <w:sz w:val="22"/>
           <w:szCs w:val="22"/>
         </w:rPr>
-        <w:t xml:space="preserve">[Speaker Category]</w:t>
+        <w:t>[Speaker Category]</w:t>
       </w:r>
     </w:p>
     <w:tbl>
@@ -5890,12 +5764,6 @@
         <w:gridCol w:w="4378"/>
       </w:tblGrid>
       <w:tr>
-        <w:tblPrEx>
-          <w:tblCellMar>
-            <w:top w:w="0" w:type="dxa"/>
-            <w:bottom w:w="0" w:type="dxa"/>
-          </w:tblCellMar>
-        </w:tblPrEx>
         <w:trPr>
           <w:tblHeader/>
         </w:trPr>
@@ -6045,12 +5913,6 @@
         </w:tc>
       </w:tr>
       <w:tr>
-        <w:tblPrEx>
-          <w:tblCellMar>
-            <w:top w:w="0" w:type="dxa"/>
-            <w:bottom w:w="0" w:type="dxa"/>
-          </w:tblCellMar>
-        </w:tblPrEx>
         <w:trPr>
           <w:cantSplit/>
         </w:trPr>
@@ -6084,7 +5946,7 @@
                 <w:sz w:val="19"/>
                 <w:szCs w:val="19"/>
               </w:rPr>
-              <w:t xml:space="preserve">[Name]</w:t>
+              <w:t>[Name]</w:t>
             </w:r>
           </w:p>
         </w:tc>
@@ -6116,7 +5978,7 @@
                 <w:sz w:val="18"/>
                 <w:szCs w:val="18"/>
               </w:rPr>
-              <w:t xml:space="preserve">[Affiliation]</w:t>
+              <w:t>[Affiliation]</w:t>
             </w:r>
           </w:p>
         </w:tc>
@@ -6148,7 +6010,7 @@
                 <w:sz w:val="18"/>
                 <w:szCs w:val="18"/>
               </w:rPr>
-              <w:t xml:space="preserve">[Expertise — the work that makes them relevant]</w:t>
+              <w:t>[Expertise — the work that makes them relevant]</w:t>
             </w:r>
           </w:p>
         </w:tc>
@@ -6180,18 +6042,12 @@
                 <w:sz w:val="18"/>
                 <w:szCs w:val="18"/>
               </w:rPr>
-              <w:t xml:space="preserve">[Focus if invited — what you would ask them to speak to]</w:t>
+              <w:t>[Focus if invited — what you would ask them to speak to]</w:t>
             </w:r>
           </w:p>
         </w:tc>
       </w:tr>
       <w:tr>
-        <w:tblPrEx>
-          <w:tblCellMar>
-            <w:top w:w="0" w:type="dxa"/>
-            <w:bottom w:w="0" w:type="dxa"/>
-          </w:tblCellMar>
-        </w:tblPrEx>
         <w:trPr>
           <w:cantSplit/>
         </w:trPr>
@@ -6225,7 +6081,7 @@
                 <w:sz w:val="19"/>
                 <w:szCs w:val="19"/>
               </w:rPr>
-              <w:t xml:space="preserve">[Name]</w:t>
+              <w:t>[Name]</w:t>
             </w:r>
           </w:p>
         </w:tc>
@@ -6257,7 +6113,7 @@
                 <w:sz w:val="18"/>
                 <w:szCs w:val="18"/>
               </w:rPr>
-              <w:t xml:space="preserve">[Affiliation]</w:t>
+              <w:t>[Affiliation]</w:t>
             </w:r>
           </w:p>
         </w:tc>
@@ -6289,7 +6145,7 @@
                 <w:sz w:val="18"/>
                 <w:szCs w:val="18"/>
               </w:rPr>
-              <w:t xml:space="preserve">[Expertise — the work that makes them relevant]</w:t>
+              <w:t>[Expertise — the work that makes them relevant]</w:t>
             </w:r>
           </w:p>
         </w:tc>
@@ -6321,18 +6177,12 @@
                 <w:sz w:val="18"/>
                 <w:szCs w:val="18"/>
               </w:rPr>
-              <w:t xml:space="preserve">[Focus if invited — what you would ask them to speak to]</w:t>
+              <w:t>[Focus if invited — what you would ask them to speak to]</w:t>
             </w:r>
           </w:p>
         </w:tc>
       </w:tr>
       <w:tr>
-        <w:tblPrEx>
-          <w:tblCellMar>
-            <w:top w:w="0" w:type="dxa"/>
-            <w:bottom w:w="0" w:type="dxa"/>
-          </w:tblCellMar>
-        </w:tblPrEx>
         <w:trPr>
           <w:cantSplit/>
         </w:trPr>
@@ -6366,7 +6216,7 @@
                 <w:sz w:val="19"/>
                 <w:szCs w:val="19"/>
               </w:rPr>
-              <w:t xml:space="preserve">[Name]</w:t>
+              <w:t>[Name]</w:t>
             </w:r>
           </w:p>
         </w:tc>
@@ -6398,7 +6248,7 @@
                 <w:sz w:val="18"/>
                 <w:szCs w:val="18"/>
               </w:rPr>
-              <w:t xml:space="preserve">[Affiliation]</w:t>
+              <w:t>[Affiliation]</w:t>
             </w:r>
           </w:p>
         </w:tc>
@@ -6430,7 +6280,7 @@
                 <w:sz w:val="18"/>
                 <w:szCs w:val="18"/>
               </w:rPr>
-              <w:t xml:space="preserve">[Expertise — the work that makes them relevant]</w:t>
+              <w:t>[Expertise — the work that makes them relevant]</w:t>
             </w:r>
           </w:p>
         </w:tc>
@@ -6462,7 +6312,7 @@
                 <w:sz w:val="18"/>
                 <w:szCs w:val="18"/>
               </w:rPr>
-              <w:t xml:space="preserve">[Focus if invited — what you would ask them to speak to]</w:t>
+              <w:t>[Focus if invited — what you would ask them to speak to]</w:t>
             </w:r>
           </w:p>
         </w:tc>
@@ -6483,7 +6333,7 @@
           <w:szCs w:val="22"/>
         </w:rPr>
         <w:lastRenderedPageBreak/>
-        <w:t xml:space="preserve">[Speaker Category]</w:t>
+        <w:t>[Speaker Category]</w:t>
       </w:r>
     </w:p>
     <w:tbl>
@@ -6510,12 +6360,6 @@
         <w:gridCol w:w="4378"/>
       </w:tblGrid>
       <w:tr>
-        <w:tblPrEx>
-          <w:tblCellMar>
-            <w:top w:w="0" w:type="dxa"/>
-            <w:bottom w:w="0" w:type="dxa"/>
-          </w:tblCellMar>
-        </w:tblPrEx>
         <w:trPr>
           <w:tblHeader/>
         </w:trPr>
@@ -6665,12 +6509,6 @@
         </w:tc>
       </w:tr>
       <w:tr>
-        <w:tblPrEx>
-          <w:tblCellMar>
-            <w:top w:w="0" w:type="dxa"/>
-            <w:bottom w:w="0" w:type="dxa"/>
-          </w:tblCellMar>
-        </w:tblPrEx>
         <w:trPr>
           <w:cantSplit/>
         </w:trPr>
@@ -6704,7 +6542,7 @@
                 <w:sz w:val="19"/>
                 <w:szCs w:val="19"/>
               </w:rPr>
-              <w:t xml:space="preserve">[Name]</w:t>
+              <w:t>[Name]</w:t>
             </w:r>
           </w:p>
         </w:tc>
@@ -6736,7 +6574,7 @@
                 <w:sz w:val="18"/>
                 <w:szCs w:val="18"/>
               </w:rPr>
-              <w:t xml:space="preserve">[Affiliation]</w:t>
+              <w:t>[Affiliation]</w:t>
             </w:r>
           </w:p>
         </w:tc>
@@ -6768,7 +6606,7 @@
                 <w:sz w:val="18"/>
                 <w:szCs w:val="18"/>
               </w:rPr>
-              <w:t xml:space="preserve">[Expertise — the work that makes them relevant]</w:t>
+              <w:t>[Expertise — the work that makes them relevant]</w:t>
             </w:r>
           </w:p>
         </w:tc>
@@ -6800,18 +6638,12 @@
                 <w:sz w:val="18"/>
                 <w:szCs w:val="18"/>
               </w:rPr>
-              <w:t xml:space="preserve">[Focus if invited — what you would ask them to speak to]</w:t>
+              <w:t>[Focus if invited — what you would ask them to speak to]</w:t>
             </w:r>
           </w:p>
         </w:tc>
       </w:tr>
       <w:tr>
-        <w:tblPrEx>
-          <w:tblCellMar>
-            <w:top w:w="0" w:type="dxa"/>
-            <w:bottom w:w="0" w:type="dxa"/>
-          </w:tblCellMar>
-        </w:tblPrEx>
         <w:trPr>
           <w:cantSplit/>
         </w:trPr>
@@ -6845,7 +6677,7 @@
                 <w:sz w:val="19"/>
                 <w:szCs w:val="19"/>
               </w:rPr>
-              <w:t xml:space="preserve">[Name]</w:t>
+              <w:t>[Name]</w:t>
             </w:r>
           </w:p>
         </w:tc>
@@ -6877,7 +6709,7 @@
                 <w:sz w:val="18"/>
                 <w:szCs w:val="18"/>
               </w:rPr>
-              <w:t xml:space="preserve">[Affiliation]</w:t>
+              <w:t>[Affiliation]</w:t>
             </w:r>
           </w:p>
         </w:tc>
@@ -6909,7 +6741,7 @@
                 <w:sz w:val="18"/>
                 <w:szCs w:val="18"/>
               </w:rPr>
-              <w:t xml:space="preserve">[Expertise — the work that makes them relevant]</w:t>
+              <w:t>[Expertise — the work that makes them relevant]</w:t>
             </w:r>
           </w:p>
         </w:tc>
@@ -6941,18 +6773,12 @@
                 <w:sz w:val="18"/>
                 <w:szCs w:val="18"/>
               </w:rPr>
-              <w:t xml:space="preserve">[Focus if invited — what you would ask them to speak to]</w:t>
+              <w:t>[Focus if invited — what you would ask them to speak to]</w:t>
             </w:r>
           </w:p>
         </w:tc>
       </w:tr>
       <w:tr>
-        <w:tblPrEx>
-          <w:tblCellMar>
-            <w:top w:w="0" w:type="dxa"/>
-            <w:bottom w:w="0" w:type="dxa"/>
-          </w:tblCellMar>
-        </w:tblPrEx>
         <w:trPr>
           <w:cantSplit/>
         </w:trPr>
@@ -6986,7 +6812,7 @@
                 <w:sz w:val="19"/>
                 <w:szCs w:val="19"/>
               </w:rPr>
-              <w:t xml:space="preserve">[Name]</w:t>
+              <w:t>[Name]</w:t>
             </w:r>
           </w:p>
         </w:tc>
@@ -7018,7 +6844,7 @@
                 <w:sz w:val="18"/>
                 <w:szCs w:val="18"/>
               </w:rPr>
-              <w:t xml:space="preserve">[Affiliation]</w:t>
+              <w:t>[Affiliation]</w:t>
             </w:r>
           </w:p>
         </w:tc>
@@ -7050,7 +6876,7 @@
                 <w:sz w:val="18"/>
                 <w:szCs w:val="18"/>
               </w:rPr>
-              <w:t xml:space="preserve">[Expertise — the work that makes them relevant]</w:t>
+              <w:t>[Expertise — the work that makes them relevant]</w:t>
             </w:r>
           </w:p>
         </w:tc>
@@ -7082,7 +6908,7 @@
                 <w:sz w:val="18"/>
                 <w:szCs w:val="18"/>
               </w:rPr>
-              <w:t xml:space="preserve">[Focus if invited — what you would ask them to speak to]</w:t>
+              <w:t>[Focus if invited — what you would ask them to speak to]</w:t>
             </w:r>
           </w:p>
         </w:tc>
@@ -7106,7 +6932,7 @@
           <w:sz w:val="22"/>
           <w:szCs w:val="22"/>
         </w:rPr>
-        <w:t xml:space="preserve">[Speaker Category]</w:t>
+        <w:t>[Speaker Category]</w:t>
       </w:r>
     </w:p>
     <w:tbl>
@@ -7132,12 +6958,6 @@
         <w:gridCol w:w="7078"/>
       </w:tblGrid>
       <w:tr>
-        <w:tblPrEx>
-          <w:tblCellMar>
-            <w:top w:w="0" w:type="dxa"/>
-            <w:bottom w:w="0" w:type="dxa"/>
-          </w:tblCellMar>
-        </w:tblPrEx>
         <w:trPr>
           <w:tblHeader/>
         </w:trPr>
@@ -7251,12 +7071,6 @@
         </w:tc>
       </w:tr>
       <w:tr>
-        <w:tblPrEx>
-          <w:tblCellMar>
-            <w:top w:w="0" w:type="dxa"/>
-            <w:bottom w:w="0" w:type="dxa"/>
-          </w:tblCellMar>
-        </w:tblPrEx>
         <w:trPr>
           <w:cantSplit/>
         </w:trPr>
@@ -7290,7 +7104,7 @@
                 <w:sz w:val="19"/>
                 <w:szCs w:val="19"/>
               </w:rPr>
-              <w:t xml:space="preserve">[Source or organisation]</w:t>
+              <w:t>[Source or organisation]</w:t>
             </w:r>
           </w:p>
         </w:tc>
@@ -7322,7 +7136,7 @@
                 <w:sz w:val="18"/>
                 <w:szCs w:val="18"/>
               </w:rPr>
-              <w:t xml:space="preserve">[Expertise]</w:t>
+              <w:t>[Expertise]</w:t>
             </w:r>
           </w:p>
         </w:tc>
@@ -7354,18 +7168,12 @@
                 <w:sz w:val="18"/>
                 <w:szCs w:val="18"/>
               </w:rPr>
-              <w:t xml:space="preserve">[Focus if invited — what you would ask them to deliver]</w:t>
+              <w:t>[Focus if invited — what you would ask them to deliver]</w:t>
             </w:r>
           </w:p>
         </w:tc>
       </w:tr>
       <w:tr>
-        <w:tblPrEx>
-          <w:tblCellMar>
-            <w:top w:w="0" w:type="dxa"/>
-            <w:bottom w:w="0" w:type="dxa"/>
-          </w:tblCellMar>
-        </w:tblPrEx>
         <w:trPr>
           <w:cantSplit/>
         </w:trPr>
@@ -7399,7 +7207,7 @@
                 <w:sz w:val="19"/>
                 <w:szCs w:val="19"/>
               </w:rPr>
-              <w:t xml:space="preserve">[Source or organisation]</w:t>
+              <w:t>[Source or organisation]</w:t>
             </w:r>
           </w:p>
         </w:tc>
@@ -7431,7 +7239,7 @@
                 <w:sz w:val="18"/>
                 <w:szCs w:val="18"/>
               </w:rPr>
-              <w:t xml:space="preserve">[Expertise]</w:t>
+              <w:t>[Expertise]</w:t>
             </w:r>
           </w:p>
         </w:tc>
@@ -7463,18 +7271,12 @@
                 <w:sz w:val="18"/>
                 <w:szCs w:val="18"/>
               </w:rPr>
-              <w:t xml:space="preserve">[Focus if invited — what you would ask them to deliver]</w:t>
+              <w:t>[Focus if invited — what you would ask them to deliver]</w:t>
             </w:r>
           </w:p>
         </w:tc>
       </w:tr>
       <w:tr>
-        <w:tblPrEx>
-          <w:tblCellMar>
-            <w:top w:w="0" w:type="dxa"/>
-            <w:bottom w:w="0" w:type="dxa"/>
-          </w:tblCellMar>
-        </w:tblPrEx>
         <w:trPr>
           <w:cantSplit/>
         </w:trPr>
@@ -7508,7 +7310,7 @@
                 <w:sz w:val="19"/>
                 <w:szCs w:val="19"/>
               </w:rPr>
-              <w:t xml:space="preserve">[Source or organisation]</w:t>
+              <w:t>[Source or organisation]</w:t>
             </w:r>
           </w:p>
         </w:tc>
@@ -7540,7 +7342,7 @@
                 <w:sz w:val="18"/>
                 <w:szCs w:val="18"/>
               </w:rPr>
-              <w:t xml:space="preserve">[Expertise]</w:t>
+              <w:t>[Expertise]</w:t>
             </w:r>
           </w:p>
         </w:tc>
@@ -7572,7 +7374,7 @@
                 <w:sz w:val="18"/>
                 <w:szCs w:val="18"/>
               </w:rPr>
-              <w:t xml:space="preserve">[Focus if invited — what you would ask them to deliver]</w:t>
+              <w:t>[Focus if invited — what you would ask them to deliver]</w:t>
             </w:r>
           </w:p>
         </w:tc>
@@ -7624,7 +7426,7 @@
           <w:sz w:val="19"/>
           <w:szCs w:val="19"/>
         </w:rPr>
-        <w:t xml:space="preserve">[Author, A., &amp; Author, B. (Year). Title of the work. Journal Name, 00(0), 000-000.]</w:t>
+        <w:t>[Author, A., &amp; Author, B. (Year). Title of the work. Journal Name, 00(0), 000-000.]</w:t>
       </w:r>
     </w:p>
     <w:p>
@@ -7639,7 +7441,7 @@
           <w:sz w:val="19"/>
           <w:szCs w:val="19"/>
         </w:rPr>
-        <w:t xml:space="preserve">[Author, A., &amp; Author, B. (Year). Title of the work. Journal Name, 00(0), 000-000.]</w:t>
+        <w:t>[Author, A., &amp; Author, B. (Year). Title of the work. Journal Name, 00(0), 000-000.]</w:t>
       </w:r>
     </w:p>
     <w:p>
@@ -7654,7 +7456,7 @@
           <w:sz w:val="19"/>
           <w:szCs w:val="19"/>
         </w:rPr>
-        <w:t xml:space="preserve">[Author, A., &amp; Author, B. (Year). Title of the work. Journal Name, 00(0), 000-000.]</w:t>
+        <w:t>[Author, A., &amp; Author, B. (Year). Title of the work. Journal Name, 00(0), 000-000.]</w:t>
       </w:r>
     </w:p>
     <w:sectPr>
@@ -7707,7 +7509,27 @@
         <w:sz w:val="15"/>
         <w:szCs w:val="15"/>
       </w:rPr>
-      <w:t>Fortune Institute of International Business, Vasant Vihar, New Delhi</w:t>
+      <w:t xml:space="preserve">Fortune Institute of International Business, Vasant </w:t>
+    </w:r>
+    <w:proofErr w:type="spellStart"/>
+    <w:r>
+      <w:rPr>
+        <w:rFonts w:ascii="Calibri" w:eastAsia="Calibri" w:hAnsi="Calibri" w:cs="Calibri"/>
+        <w:color w:val="5A6675"/>
+        <w:sz w:val="15"/>
+        <w:szCs w:val="15"/>
+      </w:rPr>
+      <w:t>Vihar</w:t>
+    </w:r>
+    <w:proofErr w:type="spellEnd"/>
+    <w:r>
+      <w:rPr>
+        <w:rFonts w:ascii="Calibri" w:eastAsia="Calibri" w:hAnsi="Calibri" w:cs="Calibri"/>
+        <w:color w:val="5A6675"/>
+        <w:sz w:val="15"/>
+        <w:szCs w:val="15"/>
+      </w:rPr>
+      <w:t>, New Delhi</w:t>
     </w:r>
     <w:r>
       <w:rPr>
@@ -7762,7 +7584,7 @@
         <w:sz w:val="15"/>
         <w:szCs w:val="15"/>
       </w:rPr>
-      <w:t>2</w:t>
+      <w:t>4</w:t>
     </w:r>
     <w:r>
       <w:rPr>
@@ -7819,7 +7641,7 @@
         <w:sz w:val="15"/>
         <w:szCs w:val="15"/>
       </w:rPr>
-      <w:t>14</w:t>
+      <w:t>11</w:t>
     </w:r>
     <w:r>
       <w:rPr>
@@ -7853,7 +7675,27 @@
         <w:sz w:val="15"/>
         <w:szCs w:val="15"/>
       </w:rPr>
-      <w:t>Fortune Institute of International Business, Vasant Vihar, New Delhi</w:t>
+      <w:t xml:space="preserve">Fortune Institute of International Business, Vasant </w:t>
+    </w:r>
+    <w:proofErr w:type="spellStart"/>
+    <w:r>
+      <w:rPr>
+        <w:rFonts w:ascii="Calibri" w:eastAsia="Calibri" w:hAnsi="Calibri" w:cs="Calibri"/>
+        <w:color w:val="5A6675"/>
+        <w:sz w:val="15"/>
+        <w:szCs w:val="15"/>
+      </w:rPr>
+      <w:t>Vihar</w:t>
+    </w:r>
+    <w:proofErr w:type="spellEnd"/>
+    <w:r>
+      <w:rPr>
+        <w:rFonts w:ascii="Calibri" w:eastAsia="Calibri" w:hAnsi="Calibri" w:cs="Calibri"/>
+        <w:color w:val="5A6675"/>
+        <w:sz w:val="15"/>
+        <w:szCs w:val="15"/>
+      </w:rPr>
+      <w:t>, New Delhi</w:t>
     </w:r>
     <w:r>
       <w:rPr>
@@ -7908,7 +7750,7 @@
         <w:sz w:val="15"/>
         <w:szCs w:val="15"/>
       </w:rPr>
-      <w:t>8</w:t>
+      <w:t>6</w:t>
     </w:r>
     <w:r>
       <w:rPr>
@@ -7965,7 +7807,7 @@
         <w:sz w:val="15"/>
         <w:szCs w:val="15"/>
       </w:rPr>
-      <w:t>14</w:t>
+      <w:t>11</w:t>
     </w:r>
     <w:r>
       <w:rPr>
@@ -7999,8 +7841,9 @@
         <w:sz w:val="15"/>
         <w:szCs w:val="15"/>
       </w:rPr>
-      <w:t>Fortun</w:t>
-    </w:r>
+      <w:t xml:space="preserve">Fortune Institute of International Business, Vasant </w:t>
+    </w:r>
+    <w:proofErr w:type="spellStart"/>
     <w:r>
       <w:rPr>
         <w:rFonts w:ascii="Calibri" w:eastAsia="Calibri" w:hAnsi="Calibri" w:cs="Calibri"/>
@@ -8008,7 +7851,17 @@
         <w:sz w:val="15"/>
         <w:szCs w:val="15"/>
       </w:rPr>
-      <w:t>e Institute of International Business, Vasant Vihar, New Delhi</w:t>
+      <w:t>Vihar</w:t>
+    </w:r>
+    <w:proofErr w:type="spellEnd"/>
+    <w:r>
+      <w:rPr>
+        <w:rFonts w:ascii="Calibri" w:eastAsia="Calibri" w:hAnsi="Calibri" w:cs="Calibri"/>
+        <w:color w:val="5A6675"/>
+        <w:sz w:val="15"/>
+        <w:szCs w:val="15"/>
+      </w:rPr>
+      <w:t>, New Delhi</w:t>
     </w:r>
     <w:r>
       <w:rPr>
@@ -8063,7 +7916,7 @@
         <w:sz w:val="15"/>
         <w:szCs w:val="15"/>
       </w:rPr>
-      <w:t>10</w:t>
+      <w:t>8</w:t>
     </w:r>
     <w:r>
       <w:rPr>
@@ -8120,7 +7973,7 @@
         <w:sz w:val="15"/>
         <w:szCs w:val="15"/>
       </w:rPr>
-      <w:t>14</w:t>
+      <w:t>11</w:t>
     </w:r>
     <w:r>
       <w:rPr>
@@ -8154,7 +8007,27 @@
         <w:sz w:val="15"/>
         <w:szCs w:val="15"/>
       </w:rPr>
-      <w:t>Fortune Institute of International Business, Vasant Vihar, New Delhi</w:t>
+      <w:t xml:space="preserve">Fortune Institute of International Business, Vasant </w:t>
+    </w:r>
+    <w:proofErr w:type="spellStart"/>
+    <w:r>
+      <w:rPr>
+        <w:rFonts w:ascii="Calibri" w:eastAsia="Calibri" w:hAnsi="Calibri" w:cs="Calibri"/>
+        <w:color w:val="5A6675"/>
+        <w:sz w:val="15"/>
+        <w:szCs w:val="15"/>
+      </w:rPr>
+      <w:t>Vihar</w:t>
+    </w:r>
+    <w:proofErr w:type="spellEnd"/>
+    <w:r>
+      <w:rPr>
+        <w:rFonts w:ascii="Calibri" w:eastAsia="Calibri" w:hAnsi="Calibri" w:cs="Calibri"/>
+        <w:color w:val="5A6675"/>
+        <w:sz w:val="15"/>
+        <w:szCs w:val="15"/>
+      </w:rPr>
+      <w:t>, New Delhi</w:t>
     </w:r>
     <w:r>
       <w:rPr>
@@ -8209,7 +8082,7 @@
         <w:sz w:val="15"/>
         <w:szCs w:val="15"/>
       </w:rPr>
-      <w:t>13</w:t>
+      <w:t>10</w:t>
     </w:r>
     <w:r>
       <w:rPr>
@@ -8266,7 +8139,7 @@
         <w:sz w:val="15"/>
         <w:szCs w:val="15"/>
       </w:rPr>
-      <w:t>14</w:t>
+      <w:t>11</w:t>
     </w:r>
     <w:r>
       <w:rPr>
@@ -8300,7 +8173,27 @@
         <w:sz w:val="15"/>
         <w:szCs w:val="15"/>
       </w:rPr>
-      <w:t>Fortune Institute of International Business, Vasant Vihar, New Delhi</w:t>
+      <w:t xml:space="preserve">Fortune Institute of International Business, Vasant </w:t>
+    </w:r>
+    <w:proofErr w:type="spellStart"/>
+    <w:r>
+      <w:rPr>
+        <w:rFonts w:ascii="Calibri" w:eastAsia="Calibri" w:hAnsi="Calibri" w:cs="Calibri"/>
+        <w:color w:val="5A6675"/>
+        <w:sz w:val="15"/>
+        <w:szCs w:val="15"/>
+      </w:rPr>
+      <w:t>Vihar</w:t>
+    </w:r>
+    <w:proofErr w:type="spellEnd"/>
+    <w:r>
+      <w:rPr>
+        <w:rFonts w:ascii="Calibri" w:eastAsia="Calibri" w:hAnsi="Calibri" w:cs="Calibri"/>
+        <w:color w:val="5A6675"/>
+        <w:sz w:val="15"/>
+        <w:szCs w:val="15"/>
+      </w:rPr>
+      <w:t>, New Delhi</w:t>
     </w:r>
     <w:r>
       <w:rPr>
@@ -8355,7 +8248,7 @@
         <w:sz w:val="15"/>
         <w:szCs w:val="15"/>
       </w:rPr>
-      <w:t>14</w:t>
+      <w:t>11</w:t>
     </w:r>
     <w:r>
       <w:rPr>
@@ -8412,7 +8305,7 @@
         <w:sz w:val="15"/>
         <w:szCs w:val="15"/>
       </w:rPr>
-      <w:t>14</w:t>
+      <w:t>11</w:t>
     </w:r>
     <w:r>
       <w:rPr>
@@ -8456,6 +8349,7 @@
       <w:spacing w:after="40"/>
       <w:jc w:val="right"/>
     </w:pPr>
+    <w:proofErr w:type="gramStart"/>
     <w:r>
       <w:rPr>
         <w:rFonts w:ascii="Calibri" w:eastAsia="Calibri" w:hAnsi="Calibri" w:cs="Calibri"/>
@@ -8475,7 +8369,37 @@
         <w:sz w:val="15"/>
         <w:szCs w:val="15"/>
       </w:rPr>
-      <w:t xml:space="preserve">  ·  Center for Innovation, Entrepreneurship &amp; Technology</w:t>
+      <w:t xml:space="preserve">  ·</w:t>
+    </w:r>
+    <w:proofErr w:type="gramEnd"/>
+    <w:r>
+      <w:rPr>
+        <w:rFonts w:ascii="Calibri" w:eastAsia="Calibri" w:hAnsi="Calibri" w:cs="Calibri"/>
+        <w:color w:val="5A6675"/>
+        <w:sz w:val="15"/>
+        <w:szCs w:val="15"/>
+      </w:rPr>
+      <w:t xml:space="preserve">  </w:t>
+    </w:r>
+    <w:proofErr w:type="spellStart"/>
+    <w:r>
+      <w:rPr>
+        <w:rFonts w:ascii="Calibri" w:eastAsia="Calibri" w:hAnsi="Calibri" w:cs="Calibri"/>
+        <w:color w:val="5A6675"/>
+        <w:sz w:val="15"/>
+        <w:szCs w:val="15"/>
+      </w:rPr>
+      <w:t>Center</w:t>
+    </w:r>
+    <w:proofErr w:type="spellEnd"/>
+    <w:r>
+      <w:rPr>
+        <w:rFonts w:ascii="Calibri" w:eastAsia="Calibri" w:hAnsi="Calibri" w:cs="Calibri"/>
+        <w:color w:val="5A6675"/>
+        <w:sz w:val="15"/>
+        <w:szCs w:val="15"/>
+      </w:rPr>
+      <w:t xml:space="preserve"> for Innovation, Entrepreneurship &amp; Technology</w:t>
     </w:r>
   </w:p>
 </w:hdr>
@@ -8491,6 +8415,7 @@
       <w:spacing w:after="40"/>
       <w:jc w:val="right"/>
     </w:pPr>
+    <w:proofErr w:type="gramStart"/>
     <w:r>
       <w:rPr>
         <w:rFonts w:ascii="Calibri" w:eastAsia="Calibri" w:hAnsi="Calibri" w:cs="Calibri"/>
@@ -8510,7 +8435,37 @@
         <w:sz w:val="15"/>
         <w:szCs w:val="15"/>
       </w:rPr>
-      <w:t xml:space="preserve">  ·  Center for Innovation, Entrepreneurship &amp; Technology</w:t>
+      <w:t xml:space="preserve">  ·</w:t>
+    </w:r>
+    <w:proofErr w:type="gramEnd"/>
+    <w:r>
+      <w:rPr>
+        <w:rFonts w:ascii="Calibri" w:eastAsia="Calibri" w:hAnsi="Calibri" w:cs="Calibri"/>
+        <w:color w:val="5A6675"/>
+        <w:sz w:val="15"/>
+        <w:szCs w:val="15"/>
+      </w:rPr>
+      <w:t xml:space="preserve">  </w:t>
+    </w:r>
+    <w:proofErr w:type="spellStart"/>
+    <w:r>
+      <w:rPr>
+        <w:rFonts w:ascii="Calibri" w:eastAsia="Calibri" w:hAnsi="Calibri" w:cs="Calibri"/>
+        <w:color w:val="5A6675"/>
+        <w:sz w:val="15"/>
+        <w:szCs w:val="15"/>
+      </w:rPr>
+      <w:t>Center</w:t>
+    </w:r>
+    <w:proofErr w:type="spellEnd"/>
+    <w:r>
+      <w:rPr>
+        <w:rFonts w:ascii="Calibri" w:eastAsia="Calibri" w:hAnsi="Calibri" w:cs="Calibri"/>
+        <w:color w:val="5A6675"/>
+        <w:sz w:val="15"/>
+        <w:szCs w:val="15"/>
+      </w:rPr>
+      <w:t xml:space="preserve"> for Innovation, Entrepreneurship &amp; Technology</w:t>
     </w:r>
   </w:p>
 </w:hdr>
@@ -8526,6 +8481,7 @@
       <w:spacing w:after="40"/>
       <w:jc w:val="right"/>
     </w:pPr>
+    <w:proofErr w:type="gramStart"/>
     <w:r>
       <w:rPr>
         <w:rFonts w:ascii="Calibri" w:eastAsia="Calibri" w:hAnsi="Calibri" w:cs="Calibri"/>
@@ -8545,7 +8501,37 @@
         <w:sz w:val="15"/>
         <w:szCs w:val="15"/>
       </w:rPr>
-      <w:t xml:space="preserve">  ·  Center for Innovation, Entrepreneurship &amp; Technology</w:t>
+      <w:t xml:space="preserve">  ·</w:t>
+    </w:r>
+    <w:proofErr w:type="gramEnd"/>
+    <w:r>
+      <w:rPr>
+        <w:rFonts w:ascii="Calibri" w:eastAsia="Calibri" w:hAnsi="Calibri" w:cs="Calibri"/>
+        <w:color w:val="5A6675"/>
+        <w:sz w:val="15"/>
+        <w:szCs w:val="15"/>
+      </w:rPr>
+      <w:t xml:space="preserve">  </w:t>
+    </w:r>
+    <w:proofErr w:type="spellStart"/>
+    <w:r>
+      <w:rPr>
+        <w:rFonts w:ascii="Calibri" w:eastAsia="Calibri" w:hAnsi="Calibri" w:cs="Calibri"/>
+        <w:color w:val="5A6675"/>
+        <w:sz w:val="15"/>
+        <w:szCs w:val="15"/>
+      </w:rPr>
+      <w:t>Center</w:t>
+    </w:r>
+    <w:proofErr w:type="spellEnd"/>
+    <w:r>
+      <w:rPr>
+        <w:rFonts w:ascii="Calibri" w:eastAsia="Calibri" w:hAnsi="Calibri" w:cs="Calibri"/>
+        <w:color w:val="5A6675"/>
+        <w:sz w:val="15"/>
+        <w:szCs w:val="15"/>
+      </w:rPr>
+      <w:t xml:space="preserve"> for Innovation, Entrepreneurship &amp; Technology</w:t>
     </w:r>
   </w:p>
 </w:hdr>
@@ -8561,6 +8547,7 @@
       <w:spacing w:after="40"/>
       <w:jc w:val="right"/>
     </w:pPr>
+    <w:proofErr w:type="gramStart"/>
     <w:r>
       <w:rPr>
         <w:rFonts w:ascii="Calibri" w:eastAsia="Calibri" w:hAnsi="Calibri" w:cs="Calibri"/>
@@ -8580,7 +8567,37 @@
         <w:sz w:val="15"/>
         <w:szCs w:val="15"/>
       </w:rPr>
-      <w:t xml:space="preserve">  ·  Center for Innovation, Entrepreneurship &amp; Technology</w:t>
+      <w:t xml:space="preserve">  ·</w:t>
+    </w:r>
+    <w:proofErr w:type="gramEnd"/>
+    <w:r>
+      <w:rPr>
+        <w:rFonts w:ascii="Calibri" w:eastAsia="Calibri" w:hAnsi="Calibri" w:cs="Calibri"/>
+        <w:color w:val="5A6675"/>
+        <w:sz w:val="15"/>
+        <w:szCs w:val="15"/>
+      </w:rPr>
+      <w:t xml:space="preserve">  </w:t>
+    </w:r>
+    <w:proofErr w:type="spellStart"/>
+    <w:r>
+      <w:rPr>
+        <w:rFonts w:ascii="Calibri" w:eastAsia="Calibri" w:hAnsi="Calibri" w:cs="Calibri"/>
+        <w:color w:val="5A6675"/>
+        <w:sz w:val="15"/>
+        <w:szCs w:val="15"/>
+      </w:rPr>
+      <w:t>Center</w:t>
+    </w:r>
+    <w:proofErr w:type="spellEnd"/>
+    <w:r>
+      <w:rPr>
+        <w:rFonts w:ascii="Calibri" w:eastAsia="Calibri" w:hAnsi="Calibri" w:cs="Calibri"/>
+        <w:color w:val="5A6675"/>
+        <w:sz w:val="15"/>
+        <w:szCs w:val="15"/>
+      </w:rPr>
+      <w:t xml:space="preserve"> for Innovation, Entrepreneurship &amp; Technology</w:t>
     </w:r>
   </w:p>
 </w:hdr>
@@ -8596,6 +8613,7 @@
       <w:spacing w:after="40"/>
       <w:jc w:val="right"/>
     </w:pPr>
+    <w:proofErr w:type="gramStart"/>
     <w:r>
       <w:rPr>
         <w:rFonts w:ascii="Calibri" w:eastAsia="Calibri" w:hAnsi="Calibri" w:cs="Calibri"/>
@@ -8615,7 +8633,37 @@
         <w:sz w:val="15"/>
         <w:szCs w:val="15"/>
       </w:rPr>
-      <w:t xml:space="preserve">  ·  Center for Innovation, Entrepreneurship &amp; Technology</w:t>
+      <w:t xml:space="preserve">  ·</w:t>
+    </w:r>
+    <w:proofErr w:type="gramEnd"/>
+    <w:r>
+      <w:rPr>
+        <w:rFonts w:ascii="Calibri" w:eastAsia="Calibri" w:hAnsi="Calibri" w:cs="Calibri"/>
+        <w:color w:val="5A6675"/>
+        <w:sz w:val="15"/>
+        <w:szCs w:val="15"/>
+      </w:rPr>
+      <w:t xml:space="preserve">  </w:t>
+    </w:r>
+    <w:proofErr w:type="spellStart"/>
+    <w:r>
+      <w:rPr>
+        <w:rFonts w:ascii="Calibri" w:eastAsia="Calibri" w:hAnsi="Calibri" w:cs="Calibri"/>
+        <w:color w:val="5A6675"/>
+        <w:sz w:val="15"/>
+        <w:szCs w:val="15"/>
+      </w:rPr>
+      <w:t>Center</w:t>
+    </w:r>
+    <w:proofErr w:type="spellEnd"/>
+    <w:r>
+      <w:rPr>
+        <w:rFonts w:ascii="Calibri" w:eastAsia="Calibri" w:hAnsi="Calibri" w:cs="Calibri"/>
+        <w:color w:val="5A6675"/>
+        <w:sz w:val="15"/>
+        <w:szCs w:val="15"/>
+      </w:rPr>
+      <w:t xml:space="preserve"> for Innovation, Entrepreneurship &amp; Technology</w:t>
     </w:r>
   </w:p>
 </w:hdr>

</xml_diff>